<commit_message>
feat: implement authentication and user management
</commit_message>
<xml_diff>
--- a/PRD.docx
+++ b/PRD.docx
@@ -55,7 +55,17 @@
     <w:p/>
     <w:p/>
     <w:p>
-      <w:r>
+      <w:pPr>
+        <w:rPr>
+          <w:b/>
+          <w:bCs/>
+        </w:rPr>
+      </w:pPr>
+      <w:r>
+        <w:rPr>
+          <w:b/>
+          <w:bCs/>
+        </w:rPr>
         <w:t xml:space="preserve">Features -&gt; </w:t>
       </w:r>
     </w:p>
@@ -2477,6 +2487,3134 @@
         </w:drawing>
       </w:r>
     </w:p>
+    <w:p>
+      <w:pPr>
+        <w:rPr>
+          <w:b/>
+          <w:bCs/>
+        </w:rPr>
+      </w:pPr>
+    </w:p>
+    <w:p>
+      <w:pPr>
+        <w:rPr>
+          <w:b/>
+          <w:bCs/>
+        </w:rPr>
+      </w:pPr>
+      <w:r>
+        <w:rPr>
+          <w:b/>
+          <w:bCs/>
+        </w:rPr>
+        <w:drawing>
+          <wp:inline distT="0" distB="0" distL="0" distR="0" wp14:anchorId="6B8090ED" wp14:editId="1C0DC820">
+            <wp:extent cx="5731510" cy="2882900"/>
+            <wp:effectExtent l="0" t="0" r="2540" b="0"/>
+            <wp:docPr id="339946057" name="Picture 1"/>
+            <wp:cNvGraphicFramePr>
+              <a:graphicFrameLocks xmlns:a="http://schemas.openxmlformats.org/drawingml/2006/main" noChangeAspect="1"/>
+            </wp:cNvGraphicFramePr>
+            <a:graphic xmlns:a="http://schemas.openxmlformats.org/drawingml/2006/main">
+              <a:graphicData uri="http://schemas.openxmlformats.org/drawingml/2006/picture">
+                <pic:pic xmlns:pic="http://schemas.openxmlformats.org/drawingml/2006/picture">
+                  <pic:nvPicPr>
+                    <pic:cNvPr id="339946057" name=""/>
+                    <pic:cNvPicPr/>
+                  </pic:nvPicPr>
+                  <pic:blipFill>
+                    <a:blip r:embed="rId11"/>
+                    <a:stretch>
+                      <a:fillRect/>
+                    </a:stretch>
+                  </pic:blipFill>
+                  <pic:spPr>
+                    <a:xfrm>
+                      <a:off x="0" y="0"/>
+                      <a:ext cx="5731510" cy="2882900"/>
+                    </a:xfrm>
+                    <a:prstGeom prst="rect">
+                      <a:avLst/>
+                    </a:prstGeom>
+                  </pic:spPr>
+                </pic:pic>
+              </a:graphicData>
+            </a:graphic>
+          </wp:inline>
+        </w:drawing>
+      </w:r>
+    </w:p>
+    <w:p>
+      <w:pPr>
+        <w:rPr>
+          <w:b/>
+          <w:bCs/>
+        </w:rPr>
+      </w:pPr>
+      <w:r>
+        <w:rPr>
+          <w:b/>
+          <w:bCs/>
+        </w:rPr>
+        <w:lastRenderedPageBreak/>
+        <w:drawing>
+          <wp:inline distT="0" distB="0" distL="0" distR="0" wp14:anchorId="0A5BEE1A" wp14:editId="03CA1ECF">
+            <wp:extent cx="5654530" cy="4198984"/>
+            <wp:effectExtent l="0" t="0" r="3810" b="0"/>
+            <wp:docPr id="1951127295" name="Picture 1"/>
+            <wp:cNvGraphicFramePr>
+              <a:graphicFrameLocks xmlns:a="http://schemas.openxmlformats.org/drawingml/2006/main" noChangeAspect="1"/>
+            </wp:cNvGraphicFramePr>
+            <a:graphic xmlns:a="http://schemas.openxmlformats.org/drawingml/2006/main">
+              <a:graphicData uri="http://schemas.openxmlformats.org/drawingml/2006/picture">
+                <pic:pic xmlns:pic="http://schemas.openxmlformats.org/drawingml/2006/picture">
+                  <pic:nvPicPr>
+                    <pic:cNvPr id="1951127295" name=""/>
+                    <pic:cNvPicPr/>
+                  </pic:nvPicPr>
+                  <pic:blipFill>
+                    <a:blip r:embed="rId12"/>
+                    <a:stretch>
+                      <a:fillRect/>
+                    </a:stretch>
+                  </pic:blipFill>
+                  <pic:spPr>
+                    <a:xfrm>
+                      <a:off x="0" y="0"/>
+                      <a:ext cx="5654530" cy="4198984"/>
+                    </a:xfrm>
+                    <a:prstGeom prst="rect">
+                      <a:avLst/>
+                    </a:prstGeom>
+                  </pic:spPr>
+                </pic:pic>
+              </a:graphicData>
+            </a:graphic>
+          </wp:inline>
+        </w:drawing>
+      </w:r>
+    </w:p>
+    <w:p>
+      <w:pPr>
+        <w:rPr>
+          <w:b/>
+          <w:bCs/>
+        </w:rPr>
+      </w:pPr>
+    </w:p>
+    <w:p>
+      <w:pPr>
+        <w:rPr>
+          <w:b/>
+          <w:bCs/>
+        </w:rPr>
+      </w:pPr>
+    </w:p>
+    <w:p>
+      <w:pPr>
+        <w:rPr>
+          <w:b/>
+          <w:bCs/>
+        </w:rPr>
+      </w:pPr>
+      <w:r>
+        <w:rPr>
+          <w:b/>
+          <w:bCs/>
+        </w:rPr>
+        <w:t>Features</w:t>
+      </w:r>
+    </w:p>
+    <w:p>
+      <w:pPr>
+        <w:rPr>
+          <w:b/>
+          <w:bCs/>
+        </w:rPr>
+      </w:pPr>
+      <w:r>
+        <w:rPr>
+          <w:b/>
+          <w:bCs/>
+        </w:rPr>
+        <w:t>Authentication</w:t>
+      </w:r>
+    </w:p>
+    <w:p>
+      <w:pPr>
+        <w:numPr>
+          <w:ilvl w:val="0"/>
+          <w:numId w:val="3"/>
+        </w:numPr>
+        <w:rPr>
+          <w:b/>
+          <w:bCs/>
+        </w:rPr>
+      </w:pPr>
+      <w:r>
+        <w:rPr>
+          <w:b/>
+          <w:bCs/>
+        </w:rPr>
+        <w:t xml:space="preserve">User Registration </w:t>
+      </w:r>
+    </w:p>
+    <w:p>
+      <w:pPr>
+        <w:numPr>
+          <w:ilvl w:val="0"/>
+          <w:numId w:val="3"/>
+        </w:numPr>
+        <w:rPr>
+          <w:b/>
+          <w:bCs/>
+        </w:rPr>
+      </w:pPr>
+      <w:r>
+        <w:rPr>
+          <w:b/>
+          <w:bCs/>
+        </w:rPr>
+        <w:t xml:space="preserve">User Login </w:t>
+      </w:r>
+    </w:p>
+    <w:p>
+      <w:pPr>
+        <w:numPr>
+          <w:ilvl w:val="0"/>
+          <w:numId w:val="3"/>
+        </w:numPr>
+        <w:rPr>
+          <w:b/>
+          <w:bCs/>
+        </w:rPr>
+      </w:pPr>
+      <w:r>
+        <w:rPr>
+          <w:b/>
+          <w:bCs/>
+        </w:rPr>
+        <w:t xml:space="preserve">User Logout </w:t>
+      </w:r>
+    </w:p>
+    <w:p>
+      <w:pPr>
+        <w:numPr>
+          <w:ilvl w:val="0"/>
+          <w:numId w:val="3"/>
+        </w:numPr>
+        <w:rPr>
+          <w:b/>
+          <w:bCs/>
+        </w:rPr>
+      </w:pPr>
+      <w:r>
+        <w:rPr>
+          <w:b/>
+          <w:bCs/>
+        </w:rPr>
+        <w:t xml:space="preserve">Refresh Access Token </w:t>
+      </w:r>
+    </w:p>
+    <w:p>
+      <w:pPr>
+        <w:numPr>
+          <w:ilvl w:val="0"/>
+          <w:numId w:val="3"/>
+        </w:numPr>
+        <w:rPr>
+          <w:b/>
+          <w:bCs/>
+        </w:rPr>
+      </w:pPr>
+      <w:r>
+        <w:rPr>
+          <w:b/>
+          <w:bCs/>
+        </w:rPr>
+        <w:t>Password Hashing (</w:t>
+      </w:r>
+      <w:proofErr w:type="spellStart"/>
+      <w:r>
+        <w:rPr>
+          <w:b/>
+          <w:bCs/>
+        </w:rPr>
+        <w:t>bcrypt</w:t>
+      </w:r>
+      <w:proofErr w:type="spellEnd"/>
+      <w:r>
+        <w:rPr>
+          <w:b/>
+          <w:bCs/>
+        </w:rPr>
+        <w:t xml:space="preserve">) </w:t>
+      </w:r>
+    </w:p>
+    <w:p>
+      <w:pPr>
+        <w:numPr>
+          <w:ilvl w:val="0"/>
+          <w:numId w:val="3"/>
+        </w:numPr>
+        <w:rPr>
+          <w:b/>
+          <w:bCs/>
+        </w:rPr>
+      </w:pPr>
+      <w:r>
+        <w:rPr>
+          <w:b/>
+          <w:bCs/>
+        </w:rPr>
+        <w:t xml:space="preserve">JWT Access Token </w:t>
+      </w:r>
+    </w:p>
+    <w:p>
+      <w:pPr>
+        <w:numPr>
+          <w:ilvl w:val="0"/>
+          <w:numId w:val="3"/>
+        </w:numPr>
+        <w:rPr>
+          <w:b/>
+          <w:bCs/>
+        </w:rPr>
+      </w:pPr>
+      <w:r>
+        <w:rPr>
+          <w:b/>
+          <w:bCs/>
+        </w:rPr>
+        <w:t xml:space="preserve">Refresh Token </w:t>
+      </w:r>
+    </w:p>
+    <w:p>
+      <w:pPr>
+        <w:numPr>
+          <w:ilvl w:val="0"/>
+          <w:numId w:val="3"/>
+        </w:numPr>
+        <w:rPr>
+          <w:b/>
+          <w:bCs/>
+        </w:rPr>
+      </w:pPr>
+      <w:r>
+        <w:rPr>
+          <w:b/>
+          <w:bCs/>
+        </w:rPr>
+        <w:t xml:space="preserve">HTTP-only Cookie Authentication </w:t>
+      </w:r>
+    </w:p>
+    <w:p>
+      <w:pPr>
+        <w:rPr>
+          <w:b/>
+          <w:bCs/>
+        </w:rPr>
+      </w:pPr>
+      <w:r>
+        <w:rPr>
+          <w:b/>
+          <w:bCs/>
+        </w:rPr>
+        <w:pict w14:anchorId="7C4338B2">
+          <v:rect id="_x0000_i1040" style="width:0;height:1.5pt" o:hralign="center" o:hrstd="t" o:hr="t" fillcolor="#a0a0a0" stroked="f"/>
+        </w:pict>
+      </w:r>
+    </w:p>
+    <w:p>
+      <w:pPr>
+        <w:rPr>
+          <w:b/>
+          <w:bCs/>
+        </w:rPr>
+      </w:pPr>
+      <w:r>
+        <w:rPr>
+          <w:b/>
+          <w:bCs/>
+        </w:rPr>
+        <w:t>User Management</w:t>
+      </w:r>
+    </w:p>
+    <w:p>
+      <w:pPr>
+        <w:numPr>
+          <w:ilvl w:val="0"/>
+          <w:numId w:val="4"/>
+        </w:numPr>
+        <w:rPr>
+          <w:b/>
+          <w:bCs/>
+        </w:rPr>
+      </w:pPr>
+      <w:r>
+        <w:rPr>
+          <w:b/>
+          <w:bCs/>
+        </w:rPr>
+        <w:lastRenderedPageBreak/>
+        <w:t xml:space="preserve">Get Current User Profile </w:t>
+      </w:r>
+    </w:p>
+    <w:p>
+      <w:pPr>
+        <w:numPr>
+          <w:ilvl w:val="0"/>
+          <w:numId w:val="4"/>
+        </w:numPr>
+        <w:rPr>
+          <w:b/>
+          <w:bCs/>
+        </w:rPr>
+      </w:pPr>
+      <w:r>
+        <w:rPr>
+          <w:b/>
+          <w:bCs/>
+        </w:rPr>
+        <w:t xml:space="preserve">Update User Profile </w:t>
+      </w:r>
+    </w:p>
+    <w:p>
+      <w:pPr>
+        <w:numPr>
+          <w:ilvl w:val="0"/>
+          <w:numId w:val="4"/>
+        </w:numPr>
+        <w:rPr>
+          <w:b/>
+          <w:bCs/>
+        </w:rPr>
+      </w:pPr>
+      <w:r>
+        <w:rPr>
+          <w:b/>
+          <w:bCs/>
+        </w:rPr>
+        <w:t xml:space="preserve">Change Password </w:t>
+      </w:r>
+    </w:p>
+    <w:p>
+      <w:pPr>
+        <w:rPr>
+          <w:b/>
+          <w:bCs/>
+        </w:rPr>
+      </w:pPr>
+      <w:r>
+        <w:rPr>
+          <w:b/>
+          <w:bCs/>
+        </w:rPr>
+        <w:pict w14:anchorId="39E2FF19">
+          <v:rect id="_x0000_i1041" style="width:0;height:1.5pt" o:hralign="center" o:hrstd="t" o:hr="t" fillcolor="#a0a0a0" stroked="f"/>
+        </w:pict>
+      </w:r>
+    </w:p>
+    <w:p>
+      <w:pPr>
+        <w:rPr>
+          <w:b/>
+          <w:bCs/>
+        </w:rPr>
+      </w:pPr>
+      <w:r>
+        <w:rPr>
+          <w:b/>
+          <w:bCs/>
+        </w:rPr>
+        <w:t>Authorization</w:t>
+      </w:r>
+    </w:p>
+    <w:p>
+      <w:pPr>
+        <w:numPr>
+          <w:ilvl w:val="0"/>
+          <w:numId w:val="5"/>
+        </w:numPr>
+        <w:rPr>
+          <w:b/>
+          <w:bCs/>
+        </w:rPr>
+      </w:pPr>
+      <w:r>
+        <w:rPr>
+          <w:b/>
+          <w:bCs/>
+        </w:rPr>
+        <w:t xml:space="preserve">JWT Authentication Middleware </w:t>
+      </w:r>
+    </w:p>
+    <w:p>
+      <w:pPr>
+        <w:numPr>
+          <w:ilvl w:val="0"/>
+          <w:numId w:val="5"/>
+        </w:numPr>
+        <w:rPr>
+          <w:b/>
+          <w:bCs/>
+        </w:rPr>
+      </w:pPr>
+      <w:r>
+        <w:rPr>
+          <w:b/>
+          <w:bCs/>
+        </w:rPr>
+        <w:t xml:space="preserve">Role-Based Access Control (RBAC) </w:t>
+      </w:r>
+    </w:p>
+    <w:p>
+      <w:pPr>
+        <w:numPr>
+          <w:ilvl w:val="0"/>
+          <w:numId w:val="5"/>
+        </w:numPr>
+        <w:rPr>
+          <w:b/>
+          <w:bCs/>
+        </w:rPr>
+      </w:pPr>
+      <w:r>
+        <w:rPr>
+          <w:b/>
+          <w:bCs/>
+        </w:rPr>
+        <w:t xml:space="preserve">Protected API Routes </w:t>
+      </w:r>
+    </w:p>
+    <w:p>
+      <w:pPr>
+        <w:rPr>
+          <w:b/>
+          <w:bCs/>
+        </w:rPr>
+      </w:pPr>
+    </w:p>
+    <w:p>
+      <w:pPr>
+        <w:rPr>
+          <w:b/>
+          <w:bCs/>
+        </w:rPr>
+      </w:pPr>
+    </w:p>
+    <w:p>
+      <w:pPr>
+        <w:rPr>
+          <w:b/>
+          <w:bCs/>
+        </w:rPr>
+      </w:pPr>
+      <w:r>
+        <w:rPr>
+          <w:b/>
+          <w:bCs/>
+        </w:rPr>
+        <w:t>Database (Authentication)</w:t>
+      </w:r>
+    </w:p>
+    <w:p>
+      <w:pPr>
+        <w:rPr>
+          <w:b/>
+          <w:bCs/>
+        </w:rPr>
+      </w:pPr>
+      <w:r>
+        <w:rPr>
+          <w:b/>
+          <w:bCs/>
+        </w:rPr>
+        <w:t>User</w:t>
+      </w:r>
+    </w:p>
+    <w:tbl>
+      <w:tblPr>
+        <w:tblW w:w="0" w:type="auto"/>
+        <w:tblCellSpacing w:w="15" w:type="dxa"/>
+        <w:tblCellMar>
+          <w:top w:w="15" w:type="dxa"/>
+          <w:left w:w="15" w:type="dxa"/>
+          <w:bottom w:w="15" w:type="dxa"/>
+          <w:right w:w="15" w:type="dxa"/>
+        </w:tblCellMar>
+        <w:tblLook w:val="04A0" w:firstRow="1" w:lastRow="0" w:firstColumn="1" w:lastColumn="0" w:noHBand="0" w:noVBand="1"/>
+      </w:tblPr>
+      <w:tblGrid>
+        <w:gridCol w:w="1469"/>
+        <w:gridCol w:w="1262"/>
+        <w:gridCol w:w="2753"/>
+      </w:tblGrid>
+      <w:tr>
+        <w:trPr>
+          <w:tblHeader/>
+          <w:tblCellSpacing w:w="15" w:type="dxa"/>
+        </w:trPr>
+        <w:tc>
+          <w:tcPr>
+            <w:tcW w:w="0" w:type="auto"/>
+            <w:vAlign w:val="center"/>
+            <w:hideMark/>
+          </w:tcPr>
+          <w:p>
+            <w:pPr>
+              <w:rPr>
+                <w:b/>
+                <w:bCs/>
+              </w:rPr>
+            </w:pPr>
+            <w:r>
+              <w:rPr>
+                <w:b/>
+                <w:bCs/>
+              </w:rPr>
+              <w:t>Field</w:t>
+            </w:r>
+          </w:p>
+        </w:tc>
+        <w:tc>
+          <w:tcPr>
+            <w:tcW w:w="0" w:type="auto"/>
+            <w:vAlign w:val="center"/>
+            <w:hideMark/>
+          </w:tcPr>
+          <w:p>
+            <w:pPr>
+              <w:rPr>
+                <w:b/>
+                <w:bCs/>
+              </w:rPr>
+            </w:pPr>
+            <w:r>
+              <w:rPr>
+                <w:b/>
+                <w:bCs/>
+              </w:rPr>
+              <w:t>Type</w:t>
+            </w:r>
+          </w:p>
+        </w:tc>
+        <w:tc>
+          <w:tcPr>
+            <w:tcW w:w="0" w:type="auto"/>
+            <w:vAlign w:val="center"/>
+            <w:hideMark/>
+          </w:tcPr>
+          <w:p>
+            <w:pPr>
+              <w:rPr>
+                <w:b/>
+                <w:bCs/>
+              </w:rPr>
+            </w:pPr>
+            <w:r>
+              <w:rPr>
+                <w:b/>
+                <w:bCs/>
+              </w:rPr>
+              <w:t>Description</w:t>
+            </w:r>
+          </w:p>
+        </w:tc>
+      </w:tr>
+      <w:tr>
+        <w:trPr>
+          <w:tblCellSpacing w:w="15" w:type="dxa"/>
+        </w:trPr>
+        <w:tc>
+          <w:tcPr>
+            <w:tcW w:w="0" w:type="auto"/>
+            <w:vAlign w:val="center"/>
+            <w:hideMark/>
+          </w:tcPr>
+          <w:p>
+            <w:pPr>
+              <w:rPr>
+                <w:b/>
+                <w:bCs/>
+              </w:rPr>
+            </w:pPr>
+            <w:r>
+              <w:rPr>
+                <w:b/>
+                <w:bCs/>
+              </w:rPr>
+              <w:t>id</w:t>
+            </w:r>
+          </w:p>
+        </w:tc>
+        <w:tc>
+          <w:tcPr>
+            <w:tcW w:w="0" w:type="auto"/>
+            <w:vAlign w:val="center"/>
+            <w:hideMark/>
+          </w:tcPr>
+          <w:p>
+            <w:pPr>
+              <w:rPr>
+                <w:b/>
+                <w:bCs/>
+              </w:rPr>
+            </w:pPr>
+            <w:r>
+              <w:rPr>
+                <w:b/>
+                <w:bCs/>
+              </w:rPr>
+              <w:t>UUID</w:t>
+            </w:r>
+          </w:p>
+        </w:tc>
+        <w:tc>
+          <w:tcPr>
+            <w:tcW w:w="0" w:type="auto"/>
+            <w:vAlign w:val="center"/>
+            <w:hideMark/>
+          </w:tcPr>
+          <w:p>
+            <w:pPr>
+              <w:rPr>
+                <w:b/>
+                <w:bCs/>
+              </w:rPr>
+            </w:pPr>
+            <w:r>
+              <w:rPr>
+                <w:b/>
+                <w:bCs/>
+              </w:rPr>
+              <w:t>Unique User ID</w:t>
+            </w:r>
+          </w:p>
+        </w:tc>
+      </w:tr>
+      <w:tr>
+        <w:trPr>
+          <w:tblCellSpacing w:w="15" w:type="dxa"/>
+        </w:trPr>
+        <w:tc>
+          <w:tcPr>
+            <w:tcW w:w="0" w:type="auto"/>
+            <w:vAlign w:val="center"/>
+            <w:hideMark/>
+          </w:tcPr>
+          <w:p>
+            <w:pPr>
+              <w:rPr>
+                <w:b/>
+                <w:bCs/>
+              </w:rPr>
+            </w:pPr>
+            <w:r>
+              <w:rPr>
+                <w:b/>
+                <w:bCs/>
+              </w:rPr>
+              <w:t>name</w:t>
+            </w:r>
+          </w:p>
+        </w:tc>
+        <w:tc>
+          <w:tcPr>
+            <w:tcW w:w="0" w:type="auto"/>
+            <w:vAlign w:val="center"/>
+            <w:hideMark/>
+          </w:tcPr>
+          <w:p>
+            <w:pPr>
+              <w:rPr>
+                <w:b/>
+                <w:bCs/>
+              </w:rPr>
+            </w:pPr>
+            <w:r>
+              <w:rPr>
+                <w:b/>
+                <w:bCs/>
+              </w:rPr>
+              <w:t>VARCHAR</w:t>
+            </w:r>
+          </w:p>
+        </w:tc>
+        <w:tc>
+          <w:tcPr>
+            <w:tcW w:w="0" w:type="auto"/>
+            <w:vAlign w:val="center"/>
+            <w:hideMark/>
+          </w:tcPr>
+          <w:p>
+            <w:pPr>
+              <w:rPr>
+                <w:b/>
+                <w:bCs/>
+              </w:rPr>
+            </w:pPr>
+            <w:r>
+              <w:rPr>
+                <w:b/>
+                <w:bCs/>
+              </w:rPr>
+              <w:t>User Name</w:t>
+            </w:r>
+          </w:p>
+        </w:tc>
+      </w:tr>
+      <w:tr>
+        <w:trPr>
+          <w:tblCellSpacing w:w="15" w:type="dxa"/>
+        </w:trPr>
+        <w:tc>
+          <w:tcPr>
+            <w:tcW w:w="0" w:type="auto"/>
+            <w:vAlign w:val="center"/>
+            <w:hideMark/>
+          </w:tcPr>
+          <w:p>
+            <w:pPr>
+              <w:rPr>
+                <w:b/>
+                <w:bCs/>
+              </w:rPr>
+            </w:pPr>
+            <w:r>
+              <w:rPr>
+                <w:b/>
+                <w:bCs/>
+              </w:rPr>
+              <w:t>email</w:t>
+            </w:r>
+          </w:p>
+        </w:tc>
+        <w:tc>
+          <w:tcPr>
+            <w:tcW w:w="0" w:type="auto"/>
+            <w:vAlign w:val="center"/>
+            <w:hideMark/>
+          </w:tcPr>
+          <w:p>
+            <w:pPr>
+              <w:rPr>
+                <w:b/>
+                <w:bCs/>
+              </w:rPr>
+            </w:pPr>
+            <w:r>
+              <w:rPr>
+                <w:b/>
+                <w:bCs/>
+              </w:rPr>
+              <w:t>VARCHAR</w:t>
+            </w:r>
+          </w:p>
+        </w:tc>
+        <w:tc>
+          <w:tcPr>
+            <w:tcW w:w="0" w:type="auto"/>
+            <w:vAlign w:val="center"/>
+            <w:hideMark/>
+          </w:tcPr>
+          <w:p>
+            <w:pPr>
+              <w:rPr>
+                <w:b/>
+                <w:bCs/>
+              </w:rPr>
+            </w:pPr>
+            <w:r>
+              <w:rPr>
+                <w:b/>
+                <w:bCs/>
+              </w:rPr>
+              <w:t>Unique Email</w:t>
+            </w:r>
+          </w:p>
+        </w:tc>
+      </w:tr>
+      <w:tr>
+        <w:trPr>
+          <w:tblCellSpacing w:w="15" w:type="dxa"/>
+        </w:trPr>
+        <w:tc>
+          <w:tcPr>
+            <w:tcW w:w="0" w:type="auto"/>
+            <w:vAlign w:val="center"/>
+            <w:hideMark/>
+          </w:tcPr>
+          <w:p>
+            <w:pPr>
+              <w:rPr>
+                <w:b/>
+                <w:bCs/>
+              </w:rPr>
+            </w:pPr>
+            <w:r>
+              <w:rPr>
+                <w:b/>
+                <w:bCs/>
+              </w:rPr>
+              <w:t>password</w:t>
+            </w:r>
+          </w:p>
+        </w:tc>
+        <w:tc>
+          <w:tcPr>
+            <w:tcW w:w="0" w:type="auto"/>
+            <w:vAlign w:val="center"/>
+            <w:hideMark/>
+          </w:tcPr>
+          <w:p>
+            <w:pPr>
+              <w:rPr>
+                <w:b/>
+                <w:bCs/>
+              </w:rPr>
+            </w:pPr>
+            <w:r>
+              <w:rPr>
+                <w:b/>
+                <w:bCs/>
+              </w:rPr>
+              <w:t>VARCHAR</w:t>
+            </w:r>
+          </w:p>
+        </w:tc>
+        <w:tc>
+          <w:tcPr>
+            <w:tcW w:w="0" w:type="auto"/>
+            <w:vAlign w:val="center"/>
+            <w:hideMark/>
+          </w:tcPr>
+          <w:p>
+            <w:pPr>
+              <w:rPr>
+                <w:b/>
+                <w:bCs/>
+              </w:rPr>
+            </w:pPr>
+            <w:r>
+              <w:rPr>
+                <w:b/>
+                <w:bCs/>
+              </w:rPr>
+              <w:t>Hashed Password</w:t>
+            </w:r>
+          </w:p>
+        </w:tc>
+      </w:tr>
+      <w:tr>
+        <w:trPr>
+          <w:tblCellSpacing w:w="15" w:type="dxa"/>
+        </w:trPr>
+        <w:tc>
+          <w:tcPr>
+            <w:tcW w:w="0" w:type="auto"/>
+            <w:vAlign w:val="center"/>
+            <w:hideMark/>
+          </w:tcPr>
+          <w:p>
+            <w:pPr>
+              <w:rPr>
+                <w:b/>
+                <w:bCs/>
+              </w:rPr>
+            </w:pPr>
+            <w:r>
+              <w:rPr>
+                <w:b/>
+                <w:bCs/>
+              </w:rPr>
+              <w:t>role</w:t>
+            </w:r>
+          </w:p>
+        </w:tc>
+        <w:tc>
+          <w:tcPr>
+            <w:tcW w:w="0" w:type="auto"/>
+            <w:vAlign w:val="center"/>
+            <w:hideMark/>
+          </w:tcPr>
+          <w:p>
+            <w:pPr>
+              <w:rPr>
+                <w:b/>
+                <w:bCs/>
+              </w:rPr>
+            </w:pPr>
+            <w:r>
+              <w:rPr>
+                <w:b/>
+                <w:bCs/>
+              </w:rPr>
+              <w:t>ENUM</w:t>
+            </w:r>
+          </w:p>
+        </w:tc>
+        <w:tc>
+          <w:tcPr>
+            <w:tcW w:w="0" w:type="auto"/>
+            <w:vAlign w:val="center"/>
+            <w:hideMark/>
+          </w:tcPr>
+          <w:p>
+            <w:pPr>
+              <w:rPr>
+                <w:b/>
+                <w:bCs/>
+              </w:rPr>
+            </w:pPr>
+            <w:r>
+              <w:rPr>
+                <w:b/>
+                <w:bCs/>
+              </w:rPr>
+              <w:t>Developer / Admin</w:t>
+            </w:r>
+          </w:p>
+        </w:tc>
+      </w:tr>
+      <w:tr>
+        <w:trPr>
+          <w:tblCellSpacing w:w="15" w:type="dxa"/>
+        </w:trPr>
+        <w:tc>
+          <w:tcPr>
+            <w:tcW w:w="0" w:type="auto"/>
+            <w:vAlign w:val="center"/>
+            <w:hideMark/>
+          </w:tcPr>
+          <w:p>
+            <w:pPr>
+              <w:rPr>
+                <w:b/>
+                <w:bCs/>
+              </w:rPr>
+            </w:pPr>
+            <w:proofErr w:type="spellStart"/>
+            <w:r>
+              <w:rPr>
+                <w:b/>
+                <w:bCs/>
+              </w:rPr>
+              <w:t>refresh_token</w:t>
+            </w:r>
+            <w:proofErr w:type="spellEnd"/>
+          </w:p>
+        </w:tc>
+        <w:tc>
+          <w:tcPr>
+            <w:tcW w:w="0" w:type="auto"/>
+            <w:vAlign w:val="center"/>
+            <w:hideMark/>
+          </w:tcPr>
+          <w:p>
+            <w:pPr>
+              <w:rPr>
+                <w:b/>
+                <w:bCs/>
+              </w:rPr>
+            </w:pPr>
+            <w:r>
+              <w:rPr>
+                <w:b/>
+                <w:bCs/>
+              </w:rPr>
+              <w:t>TEXT</w:t>
+            </w:r>
+          </w:p>
+        </w:tc>
+        <w:tc>
+          <w:tcPr>
+            <w:tcW w:w="0" w:type="auto"/>
+            <w:vAlign w:val="center"/>
+            <w:hideMark/>
+          </w:tcPr>
+          <w:p>
+            <w:pPr>
+              <w:rPr>
+                <w:b/>
+                <w:bCs/>
+              </w:rPr>
+            </w:pPr>
+            <w:r>
+              <w:rPr>
+                <w:b/>
+                <w:bCs/>
+              </w:rPr>
+              <w:t>Stores latest Refresh Token</w:t>
+            </w:r>
+          </w:p>
+        </w:tc>
+      </w:tr>
+      <w:tr>
+        <w:trPr>
+          <w:tblCellSpacing w:w="15" w:type="dxa"/>
+        </w:trPr>
+        <w:tc>
+          <w:tcPr>
+            <w:tcW w:w="0" w:type="auto"/>
+            <w:vAlign w:val="center"/>
+            <w:hideMark/>
+          </w:tcPr>
+          <w:p>
+            <w:pPr>
+              <w:rPr>
+                <w:b/>
+                <w:bCs/>
+              </w:rPr>
+            </w:pPr>
+            <w:proofErr w:type="spellStart"/>
+            <w:r>
+              <w:rPr>
+                <w:b/>
+                <w:bCs/>
+              </w:rPr>
+              <w:t>created_at</w:t>
+            </w:r>
+            <w:proofErr w:type="spellEnd"/>
+          </w:p>
+        </w:tc>
+        <w:tc>
+          <w:tcPr>
+            <w:tcW w:w="0" w:type="auto"/>
+            <w:vAlign w:val="center"/>
+            <w:hideMark/>
+          </w:tcPr>
+          <w:p>
+            <w:pPr>
+              <w:rPr>
+                <w:b/>
+                <w:bCs/>
+              </w:rPr>
+            </w:pPr>
+            <w:r>
+              <w:rPr>
+                <w:b/>
+                <w:bCs/>
+              </w:rPr>
+              <w:t>TIMESTAMP</w:t>
+            </w:r>
+          </w:p>
+        </w:tc>
+        <w:tc>
+          <w:tcPr>
+            <w:tcW w:w="0" w:type="auto"/>
+            <w:vAlign w:val="center"/>
+            <w:hideMark/>
+          </w:tcPr>
+          <w:p>
+            <w:pPr>
+              <w:rPr>
+                <w:b/>
+                <w:bCs/>
+              </w:rPr>
+            </w:pPr>
+            <w:r>
+              <w:rPr>
+                <w:b/>
+                <w:bCs/>
+              </w:rPr>
+              <w:t>Creation Time</w:t>
+            </w:r>
+          </w:p>
+        </w:tc>
+      </w:tr>
+      <w:tr>
+        <w:trPr>
+          <w:tblCellSpacing w:w="15" w:type="dxa"/>
+        </w:trPr>
+        <w:tc>
+          <w:tcPr>
+            <w:tcW w:w="0" w:type="auto"/>
+            <w:vAlign w:val="center"/>
+            <w:hideMark/>
+          </w:tcPr>
+          <w:p>
+            <w:pPr>
+              <w:rPr>
+                <w:b/>
+                <w:bCs/>
+              </w:rPr>
+            </w:pPr>
+            <w:proofErr w:type="spellStart"/>
+            <w:r>
+              <w:rPr>
+                <w:b/>
+                <w:bCs/>
+              </w:rPr>
+              <w:t>updated_at</w:t>
+            </w:r>
+            <w:proofErr w:type="spellEnd"/>
+          </w:p>
+        </w:tc>
+        <w:tc>
+          <w:tcPr>
+            <w:tcW w:w="0" w:type="auto"/>
+            <w:vAlign w:val="center"/>
+            <w:hideMark/>
+          </w:tcPr>
+          <w:p>
+            <w:pPr>
+              <w:rPr>
+                <w:b/>
+                <w:bCs/>
+              </w:rPr>
+            </w:pPr>
+            <w:r>
+              <w:rPr>
+                <w:b/>
+                <w:bCs/>
+              </w:rPr>
+              <w:t>TIMESTAMP</w:t>
+            </w:r>
+          </w:p>
+        </w:tc>
+        <w:tc>
+          <w:tcPr>
+            <w:tcW w:w="0" w:type="auto"/>
+            <w:vAlign w:val="center"/>
+            <w:hideMark/>
+          </w:tcPr>
+          <w:p>
+            <w:pPr>
+              <w:rPr>
+                <w:b/>
+                <w:bCs/>
+              </w:rPr>
+            </w:pPr>
+            <w:r>
+              <w:rPr>
+                <w:b/>
+                <w:bCs/>
+              </w:rPr>
+              <w:t>Last Updated Time</w:t>
+            </w:r>
+          </w:p>
+        </w:tc>
+      </w:tr>
+    </w:tbl>
+    <w:p>
+      <w:pPr>
+        <w:rPr>
+          <w:b/>
+          <w:bCs/>
+        </w:rPr>
+      </w:pPr>
+    </w:p>
+    <w:p>
+      <w:pPr>
+        <w:rPr>
+          <w:b/>
+          <w:bCs/>
+        </w:rPr>
+      </w:pPr>
+    </w:p>
+    <w:p>
+      <w:pPr>
+        <w:rPr>
+          <w:b/>
+          <w:bCs/>
+        </w:rPr>
+      </w:pPr>
+      <w:r>
+        <w:rPr>
+          <w:b/>
+          <w:bCs/>
+        </w:rPr>
+        <w:t>Authentication APIs</w:t>
+      </w:r>
+    </w:p>
+    <w:tbl>
+      <w:tblPr>
+        <w:tblW w:w="0" w:type="auto"/>
+        <w:tblCellSpacing w:w="15" w:type="dxa"/>
+        <w:tblCellMar>
+          <w:top w:w="15" w:type="dxa"/>
+          <w:left w:w="15" w:type="dxa"/>
+          <w:bottom w:w="15" w:type="dxa"/>
+          <w:right w:w="15" w:type="dxa"/>
+        </w:tblCellMar>
+        <w:tblLook w:val="04A0" w:firstRow="1" w:lastRow="0" w:firstColumn="1" w:lastColumn="0" w:noHBand="0" w:noVBand="1"/>
+      </w:tblPr>
+      <w:tblGrid>
+        <w:gridCol w:w="874"/>
+        <w:gridCol w:w="1879"/>
+        <w:gridCol w:w="2830"/>
+      </w:tblGrid>
+      <w:tr>
+        <w:trPr>
+          <w:tblHeader/>
+          <w:tblCellSpacing w:w="15" w:type="dxa"/>
+        </w:trPr>
+        <w:tc>
+          <w:tcPr>
+            <w:tcW w:w="0" w:type="auto"/>
+            <w:vAlign w:val="center"/>
+            <w:hideMark/>
+          </w:tcPr>
+          <w:p>
+            <w:pPr>
+              <w:rPr>
+                <w:b/>
+                <w:bCs/>
+              </w:rPr>
+            </w:pPr>
+            <w:r>
+              <w:rPr>
+                <w:b/>
+                <w:bCs/>
+              </w:rPr>
+              <w:t>Method</w:t>
+            </w:r>
+          </w:p>
+        </w:tc>
+        <w:tc>
+          <w:tcPr>
+            <w:tcW w:w="0" w:type="auto"/>
+            <w:vAlign w:val="center"/>
+            <w:hideMark/>
+          </w:tcPr>
+          <w:p>
+            <w:pPr>
+              <w:rPr>
+                <w:b/>
+                <w:bCs/>
+              </w:rPr>
+            </w:pPr>
+            <w:r>
+              <w:rPr>
+                <w:b/>
+                <w:bCs/>
+              </w:rPr>
+              <w:t>Endpoint</w:t>
+            </w:r>
+          </w:p>
+        </w:tc>
+        <w:tc>
+          <w:tcPr>
+            <w:tcW w:w="0" w:type="auto"/>
+            <w:vAlign w:val="center"/>
+            <w:hideMark/>
+          </w:tcPr>
+          <w:p>
+            <w:pPr>
+              <w:rPr>
+                <w:b/>
+                <w:bCs/>
+              </w:rPr>
+            </w:pPr>
+            <w:r>
+              <w:rPr>
+                <w:b/>
+                <w:bCs/>
+              </w:rPr>
+              <w:t>Description</w:t>
+            </w:r>
+          </w:p>
+        </w:tc>
+      </w:tr>
+      <w:tr>
+        <w:trPr>
+          <w:tblCellSpacing w:w="15" w:type="dxa"/>
+        </w:trPr>
+        <w:tc>
+          <w:tcPr>
+            <w:tcW w:w="0" w:type="auto"/>
+            <w:vAlign w:val="center"/>
+            <w:hideMark/>
+          </w:tcPr>
+          <w:p>
+            <w:pPr>
+              <w:rPr>
+                <w:b/>
+                <w:bCs/>
+              </w:rPr>
+            </w:pPr>
+            <w:r>
+              <w:rPr>
+                <w:b/>
+                <w:bCs/>
+              </w:rPr>
+              <w:t>POST</w:t>
+            </w:r>
+          </w:p>
+        </w:tc>
+        <w:tc>
+          <w:tcPr>
+            <w:tcW w:w="0" w:type="auto"/>
+            <w:vAlign w:val="center"/>
+            <w:hideMark/>
+          </w:tcPr>
+          <w:p>
+            <w:pPr>
+              <w:rPr>
+                <w:b/>
+                <w:bCs/>
+              </w:rPr>
+            </w:pPr>
+            <w:r>
+              <w:rPr>
+                <w:b/>
+                <w:bCs/>
+              </w:rPr>
+              <w:t>/</w:t>
+            </w:r>
+            <w:proofErr w:type="spellStart"/>
+            <w:r>
+              <w:rPr>
+                <w:b/>
+                <w:bCs/>
+              </w:rPr>
+              <w:t>api</w:t>
+            </w:r>
+            <w:proofErr w:type="spellEnd"/>
+            <w:r>
+              <w:rPr>
+                <w:b/>
+                <w:bCs/>
+              </w:rPr>
+              <w:t>/auth/register</w:t>
+            </w:r>
+          </w:p>
+        </w:tc>
+        <w:tc>
+          <w:tcPr>
+            <w:tcW w:w="0" w:type="auto"/>
+            <w:vAlign w:val="center"/>
+            <w:hideMark/>
+          </w:tcPr>
+          <w:p>
+            <w:pPr>
+              <w:rPr>
+                <w:b/>
+                <w:bCs/>
+              </w:rPr>
+            </w:pPr>
+            <w:r>
+              <w:rPr>
+                <w:b/>
+                <w:bCs/>
+              </w:rPr>
+              <w:t>Register a new user</w:t>
+            </w:r>
+          </w:p>
+        </w:tc>
+      </w:tr>
+      <w:tr>
+        <w:trPr>
+          <w:tblCellSpacing w:w="15" w:type="dxa"/>
+        </w:trPr>
+        <w:tc>
+          <w:tcPr>
+            <w:tcW w:w="0" w:type="auto"/>
+            <w:vAlign w:val="center"/>
+            <w:hideMark/>
+          </w:tcPr>
+          <w:p>
+            <w:pPr>
+              <w:rPr>
+                <w:b/>
+                <w:bCs/>
+              </w:rPr>
+            </w:pPr>
+            <w:r>
+              <w:rPr>
+                <w:b/>
+                <w:bCs/>
+              </w:rPr>
+              <w:lastRenderedPageBreak/>
+              <w:t>POST</w:t>
+            </w:r>
+          </w:p>
+        </w:tc>
+        <w:tc>
+          <w:tcPr>
+            <w:tcW w:w="0" w:type="auto"/>
+            <w:vAlign w:val="center"/>
+            <w:hideMark/>
+          </w:tcPr>
+          <w:p>
+            <w:pPr>
+              <w:rPr>
+                <w:b/>
+                <w:bCs/>
+              </w:rPr>
+            </w:pPr>
+            <w:r>
+              <w:rPr>
+                <w:b/>
+                <w:bCs/>
+              </w:rPr>
+              <w:t>/</w:t>
+            </w:r>
+            <w:proofErr w:type="spellStart"/>
+            <w:r>
+              <w:rPr>
+                <w:b/>
+                <w:bCs/>
+              </w:rPr>
+              <w:t>api</w:t>
+            </w:r>
+            <w:proofErr w:type="spellEnd"/>
+            <w:r>
+              <w:rPr>
+                <w:b/>
+                <w:bCs/>
+              </w:rPr>
+              <w:t>/auth/login</w:t>
+            </w:r>
+          </w:p>
+        </w:tc>
+        <w:tc>
+          <w:tcPr>
+            <w:tcW w:w="0" w:type="auto"/>
+            <w:vAlign w:val="center"/>
+            <w:hideMark/>
+          </w:tcPr>
+          <w:p>
+            <w:pPr>
+              <w:rPr>
+                <w:b/>
+                <w:bCs/>
+              </w:rPr>
+            </w:pPr>
+            <w:r>
+              <w:rPr>
+                <w:b/>
+                <w:bCs/>
+              </w:rPr>
+              <w:t>Authenticate user</w:t>
+            </w:r>
+          </w:p>
+        </w:tc>
+      </w:tr>
+      <w:tr>
+        <w:trPr>
+          <w:tblCellSpacing w:w="15" w:type="dxa"/>
+        </w:trPr>
+        <w:tc>
+          <w:tcPr>
+            <w:tcW w:w="0" w:type="auto"/>
+            <w:vAlign w:val="center"/>
+            <w:hideMark/>
+          </w:tcPr>
+          <w:p>
+            <w:pPr>
+              <w:rPr>
+                <w:b/>
+                <w:bCs/>
+              </w:rPr>
+            </w:pPr>
+            <w:r>
+              <w:rPr>
+                <w:b/>
+                <w:bCs/>
+              </w:rPr>
+              <w:t>POST</w:t>
+            </w:r>
+          </w:p>
+        </w:tc>
+        <w:tc>
+          <w:tcPr>
+            <w:tcW w:w="0" w:type="auto"/>
+            <w:vAlign w:val="center"/>
+            <w:hideMark/>
+          </w:tcPr>
+          <w:p>
+            <w:pPr>
+              <w:rPr>
+                <w:b/>
+                <w:bCs/>
+              </w:rPr>
+            </w:pPr>
+            <w:r>
+              <w:rPr>
+                <w:b/>
+                <w:bCs/>
+              </w:rPr>
+              <w:t>/</w:t>
+            </w:r>
+            <w:proofErr w:type="spellStart"/>
+            <w:r>
+              <w:rPr>
+                <w:b/>
+                <w:bCs/>
+              </w:rPr>
+              <w:t>api</w:t>
+            </w:r>
+            <w:proofErr w:type="spellEnd"/>
+            <w:r>
+              <w:rPr>
+                <w:b/>
+                <w:bCs/>
+              </w:rPr>
+              <w:t>/auth/logout</w:t>
+            </w:r>
+          </w:p>
+        </w:tc>
+        <w:tc>
+          <w:tcPr>
+            <w:tcW w:w="0" w:type="auto"/>
+            <w:vAlign w:val="center"/>
+            <w:hideMark/>
+          </w:tcPr>
+          <w:p>
+            <w:pPr>
+              <w:rPr>
+                <w:b/>
+                <w:bCs/>
+              </w:rPr>
+            </w:pPr>
+            <w:r>
+              <w:rPr>
+                <w:b/>
+                <w:bCs/>
+              </w:rPr>
+              <w:t>Logout user</w:t>
+            </w:r>
+          </w:p>
+        </w:tc>
+      </w:tr>
+      <w:tr>
+        <w:trPr>
+          <w:tblCellSpacing w:w="15" w:type="dxa"/>
+        </w:trPr>
+        <w:tc>
+          <w:tcPr>
+            <w:tcW w:w="0" w:type="auto"/>
+            <w:vAlign w:val="center"/>
+            <w:hideMark/>
+          </w:tcPr>
+          <w:p>
+            <w:pPr>
+              <w:rPr>
+                <w:b/>
+                <w:bCs/>
+              </w:rPr>
+            </w:pPr>
+            <w:r>
+              <w:rPr>
+                <w:b/>
+                <w:bCs/>
+              </w:rPr>
+              <w:t>POST</w:t>
+            </w:r>
+          </w:p>
+        </w:tc>
+        <w:tc>
+          <w:tcPr>
+            <w:tcW w:w="0" w:type="auto"/>
+            <w:vAlign w:val="center"/>
+            <w:hideMark/>
+          </w:tcPr>
+          <w:p>
+            <w:pPr>
+              <w:rPr>
+                <w:b/>
+                <w:bCs/>
+              </w:rPr>
+            </w:pPr>
+            <w:r>
+              <w:rPr>
+                <w:b/>
+                <w:bCs/>
+              </w:rPr>
+              <w:t>/</w:t>
+            </w:r>
+            <w:proofErr w:type="spellStart"/>
+            <w:r>
+              <w:rPr>
+                <w:b/>
+                <w:bCs/>
+              </w:rPr>
+              <w:t>api</w:t>
+            </w:r>
+            <w:proofErr w:type="spellEnd"/>
+            <w:r>
+              <w:rPr>
+                <w:b/>
+                <w:bCs/>
+              </w:rPr>
+              <w:t>/auth/refresh</w:t>
+            </w:r>
+          </w:p>
+        </w:tc>
+        <w:tc>
+          <w:tcPr>
+            <w:tcW w:w="0" w:type="auto"/>
+            <w:vAlign w:val="center"/>
+            <w:hideMark/>
+          </w:tcPr>
+          <w:p>
+            <w:pPr>
+              <w:rPr>
+                <w:b/>
+                <w:bCs/>
+              </w:rPr>
+            </w:pPr>
+            <w:r>
+              <w:rPr>
+                <w:b/>
+                <w:bCs/>
+              </w:rPr>
+              <w:t>Generate new Access Token</w:t>
+            </w:r>
+          </w:p>
+        </w:tc>
+      </w:tr>
+    </w:tbl>
+    <w:p>
+      <w:pPr>
+        <w:rPr>
+          <w:b/>
+          <w:bCs/>
+        </w:rPr>
+      </w:pPr>
+    </w:p>
+    <w:p>
+      <w:pPr>
+        <w:rPr>
+          <w:b/>
+          <w:bCs/>
+        </w:rPr>
+      </w:pPr>
+    </w:p>
+    <w:p>
+      <w:pPr>
+        <w:rPr>
+          <w:b/>
+          <w:bCs/>
+        </w:rPr>
+      </w:pPr>
+      <w:r>
+        <w:rPr>
+          <w:b/>
+          <w:bCs/>
+        </w:rPr>
+        <w:t>User APIs</w:t>
+      </w:r>
+    </w:p>
+    <w:tbl>
+      <w:tblPr>
+        <w:tblW w:w="0" w:type="auto"/>
+        <w:tblCellSpacing w:w="15" w:type="dxa"/>
+        <w:tblCellMar>
+          <w:top w:w="15" w:type="dxa"/>
+          <w:left w:w="15" w:type="dxa"/>
+          <w:bottom w:w="15" w:type="dxa"/>
+          <w:right w:w="15" w:type="dxa"/>
+        </w:tblCellMar>
+        <w:tblLook w:val="04A0" w:firstRow="1" w:lastRow="0" w:firstColumn="1" w:lastColumn="0" w:noHBand="0" w:noVBand="1"/>
+      </w:tblPr>
+      <w:tblGrid>
+        <w:gridCol w:w="874"/>
+        <w:gridCol w:w="2924"/>
+        <w:gridCol w:w="2603"/>
+      </w:tblGrid>
+      <w:tr>
+        <w:trPr>
+          <w:tblHeader/>
+          <w:tblCellSpacing w:w="15" w:type="dxa"/>
+        </w:trPr>
+        <w:tc>
+          <w:tcPr>
+            <w:tcW w:w="0" w:type="auto"/>
+            <w:vAlign w:val="center"/>
+            <w:hideMark/>
+          </w:tcPr>
+          <w:p>
+            <w:pPr>
+              <w:rPr>
+                <w:b/>
+                <w:bCs/>
+              </w:rPr>
+            </w:pPr>
+            <w:r>
+              <w:rPr>
+                <w:b/>
+                <w:bCs/>
+              </w:rPr>
+              <w:t>Method</w:t>
+            </w:r>
+          </w:p>
+        </w:tc>
+        <w:tc>
+          <w:tcPr>
+            <w:tcW w:w="0" w:type="auto"/>
+            <w:vAlign w:val="center"/>
+            <w:hideMark/>
+          </w:tcPr>
+          <w:p>
+            <w:pPr>
+              <w:rPr>
+                <w:b/>
+                <w:bCs/>
+              </w:rPr>
+            </w:pPr>
+            <w:r>
+              <w:rPr>
+                <w:b/>
+                <w:bCs/>
+              </w:rPr>
+              <w:t>Endpoint</w:t>
+            </w:r>
+          </w:p>
+        </w:tc>
+        <w:tc>
+          <w:tcPr>
+            <w:tcW w:w="0" w:type="auto"/>
+            <w:vAlign w:val="center"/>
+            <w:hideMark/>
+          </w:tcPr>
+          <w:p>
+            <w:pPr>
+              <w:rPr>
+                <w:b/>
+                <w:bCs/>
+              </w:rPr>
+            </w:pPr>
+            <w:r>
+              <w:rPr>
+                <w:b/>
+                <w:bCs/>
+              </w:rPr>
+              <w:t>Description</w:t>
+            </w:r>
+          </w:p>
+        </w:tc>
+      </w:tr>
+      <w:tr>
+        <w:trPr>
+          <w:tblCellSpacing w:w="15" w:type="dxa"/>
+        </w:trPr>
+        <w:tc>
+          <w:tcPr>
+            <w:tcW w:w="0" w:type="auto"/>
+            <w:vAlign w:val="center"/>
+            <w:hideMark/>
+          </w:tcPr>
+          <w:p>
+            <w:pPr>
+              <w:rPr>
+                <w:b/>
+                <w:bCs/>
+              </w:rPr>
+            </w:pPr>
+            <w:r>
+              <w:rPr>
+                <w:b/>
+                <w:bCs/>
+              </w:rPr>
+              <w:t>GET</w:t>
+            </w:r>
+          </w:p>
+        </w:tc>
+        <w:tc>
+          <w:tcPr>
+            <w:tcW w:w="0" w:type="auto"/>
+            <w:vAlign w:val="center"/>
+            <w:hideMark/>
+          </w:tcPr>
+          <w:p>
+            <w:pPr>
+              <w:rPr>
+                <w:b/>
+                <w:bCs/>
+              </w:rPr>
+            </w:pPr>
+            <w:r>
+              <w:rPr>
+                <w:b/>
+                <w:bCs/>
+              </w:rPr>
+              <w:t>/</w:t>
+            </w:r>
+            <w:proofErr w:type="spellStart"/>
+            <w:r>
+              <w:rPr>
+                <w:b/>
+                <w:bCs/>
+              </w:rPr>
+              <w:t>api</w:t>
+            </w:r>
+            <w:proofErr w:type="spellEnd"/>
+            <w:r>
+              <w:rPr>
+                <w:b/>
+                <w:bCs/>
+              </w:rPr>
+              <w:t>/users/me</w:t>
+            </w:r>
+          </w:p>
+        </w:tc>
+        <w:tc>
+          <w:tcPr>
+            <w:tcW w:w="0" w:type="auto"/>
+            <w:vAlign w:val="center"/>
+            <w:hideMark/>
+          </w:tcPr>
+          <w:p>
+            <w:pPr>
+              <w:rPr>
+                <w:b/>
+                <w:bCs/>
+              </w:rPr>
+            </w:pPr>
+            <w:r>
+              <w:rPr>
+                <w:b/>
+                <w:bCs/>
+              </w:rPr>
+              <w:t>Get logged-in user profile</w:t>
+            </w:r>
+          </w:p>
+        </w:tc>
+      </w:tr>
+      <w:tr>
+        <w:trPr>
+          <w:tblCellSpacing w:w="15" w:type="dxa"/>
+        </w:trPr>
+        <w:tc>
+          <w:tcPr>
+            <w:tcW w:w="0" w:type="auto"/>
+            <w:vAlign w:val="center"/>
+            <w:hideMark/>
+          </w:tcPr>
+          <w:p>
+            <w:pPr>
+              <w:rPr>
+                <w:b/>
+                <w:bCs/>
+              </w:rPr>
+            </w:pPr>
+            <w:r>
+              <w:rPr>
+                <w:b/>
+                <w:bCs/>
+              </w:rPr>
+              <w:t>PATCH</w:t>
+            </w:r>
+          </w:p>
+        </w:tc>
+        <w:tc>
+          <w:tcPr>
+            <w:tcW w:w="0" w:type="auto"/>
+            <w:vAlign w:val="center"/>
+            <w:hideMark/>
+          </w:tcPr>
+          <w:p>
+            <w:pPr>
+              <w:rPr>
+                <w:b/>
+                <w:bCs/>
+              </w:rPr>
+            </w:pPr>
+            <w:r>
+              <w:rPr>
+                <w:b/>
+                <w:bCs/>
+              </w:rPr>
+              <w:t>/</w:t>
+            </w:r>
+            <w:proofErr w:type="spellStart"/>
+            <w:r>
+              <w:rPr>
+                <w:b/>
+                <w:bCs/>
+              </w:rPr>
+              <w:t>api</w:t>
+            </w:r>
+            <w:proofErr w:type="spellEnd"/>
+            <w:r>
+              <w:rPr>
+                <w:b/>
+                <w:bCs/>
+              </w:rPr>
+              <w:t>/users/me</w:t>
+            </w:r>
+          </w:p>
+        </w:tc>
+        <w:tc>
+          <w:tcPr>
+            <w:tcW w:w="0" w:type="auto"/>
+            <w:vAlign w:val="center"/>
+            <w:hideMark/>
+          </w:tcPr>
+          <w:p>
+            <w:pPr>
+              <w:rPr>
+                <w:b/>
+                <w:bCs/>
+              </w:rPr>
+            </w:pPr>
+            <w:r>
+              <w:rPr>
+                <w:b/>
+                <w:bCs/>
+              </w:rPr>
+              <w:t>Update profile</w:t>
+            </w:r>
+          </w:p>
+        </w:tc>
+      </w:tr>
+      <w:tr>
+        <w:trPr>
+          <w:tblCellSpacing w:w="15" w:type="dxa"/>
+        </w:trPr>
+        <w:tc>
+          <w:tcPr>
+            <w:tcW w:w="0" w:type="auto"/>
+            <w:vAlign w:val="center"/>
+            <w:hideMark/>
+          </w:tcPr>
+          <w:p>
+            <w:pPr>
+              <w:rPr>
+                <w:b/>
+                <w:bCs/>
+              </w:rPr>
+            </w:pPr>
+            <w:r>
+              <w:rPr>
+                <w:b/>
+                <w:bCs/>
+              </w:rPr>
+              <w:t>PATCH</w:t>
+            </w:r>
+          </w:p>
+        </w:tc>
+        <w:tc>
+          <w:tcPr>
+            <w:tcW w:w="0" w:type="auto"/>
+            <w:vAlign w:val="center"/>
+            <w:hideMark/>
+          </w:tcPr>
+          <w:p>
+            <w:pPr>
+              <w:rPr>
+                <w:b/>
+                <w:bCs/>
+              </w:rPr>
+            </w:pPr>
+            <w:r>
+              <w:rPr>
+                <w:b/>
+                <w:bCs/>
+              </w:rPr>
+              <w:t>/</w:t>
+            </w:r>
+            <w:proofErr w:type="spellStart"/>
+            <w:r>
+              <w:rPr>
+                <w:b/>
+                <w:bCs/>
+              </w:rPr>
+              <w:t>api</w:t>
+            </w:r>
+            <w:proofErr w:type="spellEnd"/>
+            <w:r>
+              <w:rPr>
+                <w:b/>
+                <w:bCs/>
+              </w:rPr>
+              <w:t>/users/change-password</w:t>
+            </w:r>
+          </w:p>
+        </w:tc>
+        <w:tc>
+          <w:tcPr>
+            <w:tcW w:w="0" w:type="auto"/>
+            <w:vAlign w:val="center"/>
+            <w:hideMark/>
+          </w:tcPr>
+          <w:p>
+            <w:pPr>
+              <w:rPr>
+                <w:b/>
+                <w:bCs/>
+              </w:rPr>
+            </w:pPr>
+            <w:r>
+              <w:rPr>
+                <w:b/>
+                <w:bCs/>
+              </w:rPr>
+              <w:t>Change password</w:t>
+            </w:r>
+          </w:p>
+        </w:tc>
+      </w:tr>
+    </w:tbl>
+    <w:p>
+      <w:pPr>
+        <w:rPr>
+          <w:b/>
+          <w:bCs/>
+        </w:rPr>
+      </w:pPr>
+    </w:p>
+    <w:p>
+      <w:pPr>
+        <w:rPr>
+          <w:b/>
+          <w:bCs/>
+        </w:rPr>
+      </w:pPr>
+    </w:p>
+    <w:p>
+      <w:pPr>
+        <w:rPr>
+          <w:b/>
+          <w:bCs/>
+        </w:rPr>
+      </w:pPr>
+      <w:r>
+        <w:rPr>
+          <w:b/>
+          <w:bCs/>
+        </w:rPr>
+        <w:t>Authentication Flow</w:t>
+      </w:r>
+    </w:p>
+    <w:p>
+      <w:pPr>
+        <w:rPr>
+          <w:b/>
+          <w:bCs/>
+        </w:rPr>
+      </w:pPr>
+      <w:r>
+        <w:rPr>
+          <w:b/>
+          <w:bCs/>
+        </w:rPr>
+        <w:t>Client</w:t>
+      </w:r>
+    </w:p>
+    <w:p>
+      <w:pPr>
+        <w:rPr>
+          <w:b/>
+          <w:bCs/>
+        </w:rPr>
+      </w:pPr>
+      <w:r>
+        <w:rPr>
+          <w:b/>
+          <w:bCs/>
+        </w:rPr>
+        <w:t xml:space="preserve">   │</w:t>
+      </w:r>
+    </w:p>
+    <w:p>
+      <w:pPr>
+        <w:rPr>
+          <w:b/>
+          <w:bCs/>
+        </w:rPr>
+      </w:pPr>
+      <w:r>
+        <w:rPr>
+          <w:b/>
+          <w:bCs/>
+        </w:rPr>
+        <w:t>Register/Login</w:t>
+      </w:r>
+    </w:p>
+    <w:p>
+      <w:pPr>
+        <w:rPr>
+          <w:b/>
+          <w:bCs/>
+        </w:rPr>
+      </w:pPr>
+      <w:r>
+        <w:rPr>
+          <w:b/>
+          <w:bCs/>
+        </w:rPr>
+        <w:t xml:space="preserve">   │</w:t>
+      </w:r>
+    </w:p>
+    <w:p>
+      <w:pPr>
+        <w:rPr>
+          <w:b/>
+          <w:bCs/>
+        </w:rPr>
+      </w:pPr>
+      <w:r>
+        <w:rPr>
+          <w:b/>
+          <w:bCs/>
+        </w:rPr>
+        <w:t xml:space="preserve">   </w:t>
+      </w:r>
+      <w:r>
+        <w:rPr>
+          <w:rFonts w:ascii="Arial" w:hAnsi="Arial" w:cs="Arial"/>
+          <w:b/>
+          <w:bCs/>
+        </w:rPr>
+        <w:t>▼</w:t>
+      </w:r>
+    </w:p>
+    <w:p>
+      <w:pPr>
+        <w:rPr>
+          <w:b/>
+          <w:bCs/>
+        </w:rPr>
+      </w:pPr>
+      <w:r>
+        <w:rPr>
+          <w:b/>
+          <w:bCs/>
+        </w:rPr>
+        <w:t>Auth Controller</w:t>
+      </w:r>
+    </w:p>
+    <w:p>
+      <w:pPr>
+        <w:rPr>
+          <w:b/>
+          <w:bCs/>
+        </w:rPr>
+      </w:pPr>
+      <w:r>
+        <w:rPr>
+          <w:b/>
+          <w:bCs/>
+        </w:rPr>
+        <w:t xml:space="preserve">   │</w:t>
+      </w:r>
+    </w:p>
+    <w:p>
+      <w:pPr>
+        <w:rPr>
+          <w:b/>
+          <w:bCs/>
+        </w:rPr>
+      </w:pPr>
+      <w:r>
+        <w:rPr>
+          <w:b/>
+          <w:bCs/>
+        </w:rPr>
+        <w:t xml:space="preserve">   </w:t>
+      </w:r>
+      <w:r>
+        <w:rPr>
+          <w:rFonts w:ascii="Arial" w:hAnsi="Arial" w:cs="Arial"/>
+          <w:b/>
+          <w:bCs/>
+        </w:rPr>
+        <w:t>▼</w:t>
+      </w:r>
+    </w:p>
+    <w:p>
+      <w:pPr>
+        <w:rPr>
+          <w:b/>
+          <w:bCs/>
+        </w:rPr>
+      </w:pPr>
+      <w:r>
+        <w:rPr>
+          <w:b/>
+          <w:bCs/>
+        </w:rPr>
+        <w:t>Auth Service</w:t>
+      </w:r>
+    </w:p>
+    <w:p>
+      <w:pPr>
+        <w:rPr>
+          <w:b/>
+          <w:bCs/>
+        </w:rPr>
+      </w:pPr>
+      <w:r>
+        <w:rPr>
+          <w:b/>
+          <w:bCs/>
+        </w:rPr>
+        <w:t xml:space="preserve">   │</w:t>
+      </w:r>
+    </w:p>
+    <w:p>
+      <w:pPr>
+        <w:rPr>
+          <w:b/>
+          <w:bCs/>
+        </w:rPr>
+      </w:pPr>
+      <w:r>
+        <w:rPr>
+          <w:b/>
+          <w:bCs/>
+        </w:rPr>
+        <w:t xml:space="preserve">   </w:t>
+      </w:r>
+      <w:r>
+        <w:rPr>
+          <w:rFonts w:ascii="Arial" w:hAnsi="Arial" w:cs="Arial"/>
+          <w:b/>
+          <w:bCs/>
+        </w:rPr>
+        <w:t>▼</w:t>
+      </w:r>
+    </w:p>
+    <w:p>
+      <w:pPr>
+        <w:rPr>
+          <w:b/>
+          <w:bCs/>
+        </w:rPr>
+      </w:pPr>
+      <w:r>
+        <w:rPr>
+          <w:b/>
+          <w:bCs/>
+        </w:rPr>
+        <w:t>Auth Repository</w:t>
+      </w:r>
+    </w:p>
+    <w:p>
+      <w:pPr>
+        <w:rPr>
+          <w:b/>
+          <w:bCs/>
+        </w:rPr>
+      </w:pPr>
+      <w:r>
+        <w:rPr>
+          <w:b/>
+          <w:bCs/>
+        </w:rPr>
+        <w:t xml:space="preserve">   │</w:t>
+      </w:r>
+    </w:p>
+    <w:p>
+      <w:pPr>
+        <w:rPr>
+          <w:b/>
+          <w:bCs/>
+        </w:rPr>
+      </w:pPr>
+      <w:r>
+        <w:rPr>
+          <w:b/>
+          <w:bCs/>
+        </w:rPr>
+        <w:lastRenderedPageBreak/>
+        <w:t xml:space="preserve">   </w:t>
+      </w:r>
+      <w:r>
+        <w:rPr>
+          <w:rFonts w:ascii="Arial" w:hAnsi="Arial" w:cs="Arial"/>
+          <w:b/>
+          <w:bCs/>
+        </w:rPr>
+        <w:t>▼</w:t>
+      </w:r>
+    </w:p>
+    <w:p>
+      <w:pPr>
+        <w:rPr>
+          <w:b/>
+          <w:bCs/>
+        </w:rPr>
+      </w:pPr>
+      <w:r>
+        <w:rPr>
+          <w:b/>
+          <w:bCs/>
+        </w:rPr>
+        <w:t>PostgreSQL</w:t>
+      </w:r>
+    </w:p>
+    <w:p>
+      <w:pPr>
+        <w:rPr>
+          <w:b/>
+          <w:bCs/>
+        </w:rPr>
+      </w:pPr>
+      <w:r>
+        <w:rPr>
+          <w:b/>
+          <w:bCs/>
+        </w:rPr>
+        <w:t xml:space="preserve">   │</w:t>
+      </w:r>
+    </w:p>
+    <w:p>
+      <w:pPr>
+        <w:rPr>
+          <w:b/>
+          <w:bCs/>
+        </w:rPr>
+      </w:pPr>
+      <w:r>
+        <w:rPr>
+          <w:b/>
+          <w:bCs/>
+        </w:rPr>
+        <w:t xml:space="preserve">   </w:t>
+      </w:r>
+      <w:r>
+        <w:rPr>
+          <w:rFonts w:ascii="Arial" w:hAnsi="Arial" w:cs="Arial"/>
+          <w:b/>
+          <w:bCs/>
+        </w:rPr>
+        <w:t>▼</w:t>
+      </w:r>
+    </w:p>
+    <w:p>
+      <w:pPr>
+        <w:rPr>
+          <w:b/>
+          <w:bCs/>
+        </w:rPr>
+      </w:pPr>
+      <w:r>
+        <w:rPr>
+          <w:b/>
+          <w:bCs/>
+        </w:rPr>
+        <w:t>Generate JWT</w:t>
+      </w:r>
+    </w:p>
+    <w:p>
+      <w:pPr>
+        <w:rPr>
+          <w:b/>
+          <w:bCs/>
+        </w:rPr>
+      </w:pPr>
+      <w:r>
+        <w:rPr>
+          <w:b/>
+          <w:bCs/>
+        </w:rPr>
+        <w:t xml:space="preserve">   │</w:t>
+      </w:r>
+    </w:p>
+    <w:p>
+      <w:pPr>
+        <w:rPr>
+          <w:b/>
+          <w:bCs/>
+        </w:rPr>
+      </w:pPr>
+      <w:r>
+        <w:rPr>
+          <w:b/>
+          <w:bCs/>
+        </w:rPr>
+        <w:t xml:space="preserve">   </w:t>
+      </w:r>
+      <w:r>
+        <w:rPr>
+          <w:rFonts w:ascii="Arial" w:hAnsi="Arial" w:cs="Arial"/>
+          <w:b/>
+          <w:bCs/>
+        </w:rPr>
+        <w:t>▼</w:t>
+      </w:r>
+    </w:p>
+    <w:p>
+      <w:pPr>
+        <w:rPr>
+          <w:b/>
+          <w:bCs/>
+        </w:rPr>
+      </w:pPr>
+      <w:r>
+        <w:rPr>
+          <w:b/>
+          <w:bCs/>
+        </w:rPr>
+        <w:t>Access Token + Refresh Token</w:t>
+      </w:r>
+    </w:p>
+    <w:p>
+      <w:pPr>
+        <w:rPr>
+          <w:b/>
+          <w:bCs/>
+        </w:rPr>
+      </w:pPr>
+    </w:p>
+    <w:p>
+      <w:pPr>
+        <w:rPr>
+          <w:b/>
+          <w:bCs/>
+        </w:rPr>
+      </w:pPr>
+    </w:p>
+    <w:p>
+      <w:pPr>
+        <w:rPr>
+          <w:b/>
+          <w:bCs/>
+        </w:rPr>
+      </w:pPr>
+      <w:r>
+        <w:rPr>
+          <w:b/>
+          <w:bCs/>
+        </w:rPr>
+        <w:t>Client</w:t>
+      </w:r>
+    </w:p>
+    <w:p>
+      <w:pPr>
+        <w:rPr>
+          <w:b/>
+          <w:bCs/>
+        </w:rPr>
+      </w:pPr>
+      <w:r>
+        <w:rPr>
+          <w:b/>
+          <w:bCs/>
+        </w:rPr>
+        <w:t xml:space="preserve">   │</w:t>
+      </w:r>
+    </w:p>
+    <w:p>
+      <w:pPr>
+        <w:rPr>
+          <w:b/>
+          <w:bCs/>
+        </w:rPr>
+      </w:pPr>
+      <w:r>
+        <w:rPr>
+          <w:b/>
+          <w:bCs/>
+        </w:rPr>
+        <w:t>Bearer Access Token</w:t>
+      </w:r>
+    </w:p>
+    <w:p>
+      <w:pPr>
+        <w:rPr>
+          <w:b/>
+          <w:bCs/>
+        </w:rPr>
+      </w:pPr>
+      <w:r>
+        <w:rPr>
+          <w:b/>
+          <w:bCs/>
+        </w:rPr>
+        <w:t xml:space="preserve">   │</w:t>
+      </w:r>
+    </w:p>
+    <w:p>
+      <w:pPr>
+        <w:rPr>
+          <w:b/>
+          <w:bCs/>
+        </w:rPr>
+      </w:pPr>
+      <w:r>
+        <w:rPr>
+          <w:b/>
+          <w:bCs/>
+        </w:rPr>
+        <w:t xml:space="preserve">   </w:t>
+      </w:r>
+      <w:r>
+        <w:rPr>
+          <w:rFonts w:ascii="Arial" w:hAnsi="Arial" w:cs="Arial"/>
+          <w:b/>
+          <w:bCs/>
+        </w:rPr>
+        <w:t>▼</w:t>
+      </w:r>
+    </w:p>
+    <w:p>
+      <w:pPr>
+        <w:rPr>
+          <w:b/>
+          <w:bCs/>
+        </w:rPr>
+      </w:pPr>
+      <w:r>
+        <w:rPr>
+          <w:b/>
+          <w:bCs/>
+        </w:rPr>
+        <w:t>Authentication Middleware</w:t>
+      </w:r>
+    </w:p>
+    <w:p>
+      <w:pPr>
+        <w:rPr>
+          <w:b/>
+          <w:bCs/>
+        </w:rPr>
+      </w:pPr>
+      <w:r>
+        <w:rPr>
+          <w:b/>
+          <w:bCs/>
+        </w:rPr>
+        <w:t xml:space="preserve">   │</w:t>
+      </w:r>
+    </w:p>
+    <w:p>
+      <w:pPr>
+        <w:rPr>
+          <w:b/>
+          <w:bCs/>
+        </w:rPr>
+      </w:pPr>
+      <w:r>
+        <w:rPr>
+          <w:b/>
+          <w:bCs/>
+        </w:rPr>
+        <w:t>Verify JWT</w:t>
+      </w:r>
+    </w:p>
+    <w:p>
+      <w:pPr>
+        <w:rPr>
+          <w:b/>
+          <w:bCs/>
+        </w:rPr>
+      </w:pPr>
+      <w:r>
+        <w:rPr>
+          <w:b/>
+          <w:bCs/>
+        </w:rPr>
+        <w:t xml:space="preserve">   │</w:t>
+      </w:r>
+    </w:p>
+    <w:p>
+      <w:pPr>
+        <w:rPr>
+          <w:b/>
+          <w:bCs/>
+        </w:rPr>
+      </w:pPr>
+      <w:r>
+        <w:rPr>
+          <w:b/>
+          <w:bCs/>
+        </w:rPr>
+        <w:t xml:space="preserve">   </w:t>
+      </w:r>
+      <w:r>
+        <w:rPr>
+          <w:rFonts w:ascii="Arial" w:hAnsi="Arial" w:cs="Arial"/>
+          <w:b/>
+          <w:bCs/>
+        </w:rPr>
+        <w:t>▼</w:t>
+      </w:r>
+    </w:p>
+    <w:p>
+      <w:pPr>
+        <w:rPr>
+          <w:b/>
+          <w:bCs/>
+        </w:rPr>
+      </w:pPr>
+      <w:r>
+        <w:rPr>
+          <w:b/>
+          <w:bCs/>
+        </w:rPr>
+        <w:t xml:space="preserve">Attach User to </w:t>
+      </w:r>
+      <w:proofErr w:type="spellStart"/>
+      <w:r>
+        <w:rPr>
+          <w:b/>
+          <w:bCs/>
+        </w:rPr>
+        <w:t>req.user</w:t>
+      </w:r>
+      <w:proofErr w:type="spellEnd"/>
+    </w:p>
+    <w:p>
+      <w:pPr>
+        <w:rPr>
+          <w:b/>
+          <w:bCs/>
+        </w:rPr>
+      </w:pPr>
+      <w:r>
+        <w:rPr>
+          <w:b/>
+          <w:bCs/>
+        </w:rPr>
+        <w:t xml:space="preserve">   │</w:t>
+      </w:r>
+    </w:p>
+    <w:p>
+      <w:pPr>
+        <w:rPr>
+          <w:b/>
+          <w:bCs/>
+        </w:rPr>
+      </w:pPr>
+      <w:r>
+        <w:rPr>
+          <w:b/>
+          <w:bCs/>
+        </w:rPr>
+        <w:t xml:space="preserve">   </w:t>
+      </w:r>
+      <w:r>
+        <w:rPr>
+          <w:rFonts w:ascii="Arial" w:hAnsi="Arial" w:cs="Arial"/>
+          <w:b/>
+          <w:bCs/>
+        </w:rPr>
+        <w:t>▼</w:t>
+      </w:r>
+    </w:p>
+    <w:p>
+      <w:pPr>
+        <w:rPr>
+          <w:b/>
+          <w:bCs/>
+        </w:rPr>
+      </w:pPr>
+      <w:r>
+        <w:rPr>
+          <w:b/>
+          <w:bCs/>
+        </w:rPr>
+        <w:t>Protected Route</w:t>
+      </w:r>
+    </w:p>
+    <w:p>
+      <w:pPr>
+        <w:rPr>
+          <w:b/>
+          <w:bCs/>
+        </w:rPr>
+      </w:pPr>
+      <w:r>
+        <w:rPr>
+          <w:b/>
+          <w:bCs/>
+        </w:rPr>
+        <w:t xml:space="preserve">   │</w:t>
+      </w:r>
+    </w:p>
+    <w:p>
+      <w:pPr>
+        <w:rPr>
+          <w:b/>
+          <w:bCs/>
+        </w:rPr>
+      </w:pPr>
+      <w:r>
+        <w:rPr>
+          <w:b/>
+          <w:bCs/>
+        </w:rPr>
+        <w:t xml:space="preserve">   </w:t>
+      </w:r>
+      <w:r>
+        <w:rPr>
+          <w:rFonts w:ascii="Arial" w:hAnsi="Arial" w:cs="Arial"/>
+          <w:b/>
+          <w:bCs/>
+        </w:rPr>
+        <w:t>▼</w:t>
+      </w:r>
+    </w:p>
+    <w:p>
+      <w:pPr>
+        <w:rPr>
+          <w:b/>
+          <w:bCs/>
+        </w:rPr>
+      </w:pPr>
+      <w:r>
+        <w:rPr>
+          <w:b/>
+          <w:bCs/>
+        </w:rPr>
+        <w:t>Controller</w:t>
+      </w:r>
+    </w:p>
+    <w:p>
+      <w:pPr>
+        <w:rPr>
+          <w:b/>
+          <w:bCs/>
+        </w:rPr>
+      </w:pPr>
+      <w:r>
+        <w:rPr>
+          <w:b/>
+          <w:bCs/>
+        </w:rPr>
+        <w:t xml:space="preserve">   │</w:t>
+      </w:r>
+    </w:p>
+    <w:p>
+      <w:pPr>
+        <w:rPr>
+          <w:b/>
+          <w:bCs/>
+        </w:rPr>
+      </w:pPr>
+      <w:r>
+        <w:rPr>
+          <w:b/>
+          <w:bCs/>
+        </w:rPr>
+        <w:lastRenderedPageBreak/>
+        <w:t xml:space="preserve">   </w:t>
+      </w:r>
+      <w:r>
+        <w:rPr>
+          <w:rFonts w:ascii="Arial" w:hAnsi="Arial" w:cs="Arial"/>
+          <w:b/>
+          <w:bCs/>
+        </w:rPr>
+        <w:t>▼</w:t>
+      </w:r>
+    </w:p>
+    <w:p>
+      <w:pPr>
+        <w:rPr>
+          <w:b/>
+          <w:bCs/>
+        </w:rPr>
+      </w:pPr>
+      <w:r>
+        <w:rPr>
+          <w:b/>
+          <w:bCs/>
+        </w:rPr>
+        <w:t>Service</w:t>
+      </w:r>
+    </w:p>
+    <w:p>
+      <w:pPr>
+        <w:rPr>
+          <w:b/>
+          <w:bCs/>
+        </w:rPr>
+      </w:pPr>
+      <w:r>
+        <w:rPr>
+          <w:b/>
+          <w:bCs/>
+        </w:rPr>
+        <w:t xml:space="preserve">   │</w:t>
+      </w:r>
+    </w:p>
+    <w:p>
+      <w:pPr>
+        <w:rPr>
+          <w:b/>
+          <w:bCs/>
+        </w:rPr>
+      </w:pPr>
+      <w:r>
+        <w:rPr>
+          <w:b/>
+          <w:bCs/>
+        </w:rPr>
+        <w:t xml:space="preserve">   </w:t>
+      </w:r>
+      <w:r>
+        <w:rPr>
+          <w:rFonts w:ascii="Arial" w:hAnsi="Arial" w:cs="Arial"/>
+          <w:b/>
+          <w:bCs/>
+        </w:rPr>
+        <w:t>▼</w:t>
+      </w:r>
+    </w:p>
+    <w:p>
+      <w:pPr>
+        <w:rPr>
+          <w:b/>
+          <w:bCs/>
+        </w:rPr>
+      </w:pPr>
+      <w:r>
+        <w:rPr>
+          <w:b/>
+          <w:bCs/>
+        </w:rPr>
+        <w:t>Repository</w:t>
+      </w:r>
+    </w:p>
+    <w:p>
+      <w:pPr>
+        <w:rPr>
+          <w:b/>
+          <w:bCs/>
+        </w:rPr>
+      </w:pPr>
+      <w:r>
+        <w:rPr>
+          <w:b/>
+          <w:bCs/>
+        </w:rPr>
+        <w:t xml:space="preserve">   │</w:t>
+      </w:r>
+    </w:p>
+    <w:p>
+      <w:pPr>
+        <w:rPr>
+          <w:b/>
+          <w:bCs/>
+        </w:rPr>
+      </w:pPr>
+      <w:r>
+        <w:rPr>
+          <w:b/>
+          <w:bCs/>
+        </w:rPr>
+        <w:t xml:space="preserve">   </w:t>
+      </w:r>
+      <w:r>
+        <w:rPr>
+          <w:rFonts w:ascii="Arial" w:hAnsi="Arial" w:cs="Arial"/>
+          <w:b/>
+          <w:bCs/>
+        </w:rPr>
+        <w:t>▼</w:t>
+      </w:r>
+    </w:p>
+    <w:p>
+      <w:pPr>
+        <w:rPr>
+          <w:b/>
+          <w:bCs/>
+        </w:rPr>
+      </w:pPr>
+      <w:r>
+        <w:rPr>
+          <w:b/>
+          <w:bCs/>
+        </w:rPr>
+        <w:t>Database</w:t>
+      </w:r>
+    </w:p>
+    <w:p>
+      <w:pPr>
+        <w:rPr>
+          <w:b/>
+          <w:bCs/>
+        </w:rPr>
+      </w:pPr>
+    </w:p>
+    <w:p>
+      <w:pPr>
+        <w:rPr>
+          <w:b/>
+          <w:bCs/>
+        </w:rPr>
+      </w:pPr>
+      <w:r>
+        <w:rPr>
+          <w:b/>
+          <w:bCs/>
+        </w:rPr>
+        <w:t>Security Features</w:t>
+      </w:r>
+    </w:p>
+    <w:p>
+      <w:pPr>
+        <w:numPr>
+          <w:ilvl w:val="0"/>
+          <w:numId w:val="6"/>
+        </w:numPr>
+        <w:rPr>
+          <w:b/>
+          <w:bCs/>
+        </w:rPr>
+      </w:pPr>
+      <w:r>
+        <w:rPr>
+          <w:b/>
+          <w:bCs/>
+        </w:rPr>
+        <w:t xml:space="preserve">Password Hashing using </w:t>
+      </w:r>
+      <w:proofErr w:type="spellStart"/>
+      <w:r>
+        <w:rPr>
+          <w:b/>
+          <w:bCs/>
+        </w:rPr>
+        <w:t>bcrypt</w:t>
+      </w:r>
+      <w:proofErr w:type="spellEnd"/>
+      <w:r>
+        <w:rPr>
+          <w:b/>
+          <w:bCs/>
+        </w:rPr>
+        <w:t xml:space="preserve"> </w:t>
+      </w:r>
+    </w:p>
+    <w:p>
+      <w:pPr>
+        <w:numPr>
+          <w:ilvl w:val="0"/>
+          <w:numId w:val="6"/>
+        </w:numPr>
+        <w:rPr>
+          <w:b/>
+          <w:bCs/>
+        </w:rPr>
+      </w:pPr>
+      <w:r>
+        <w:rPr>
+          <w:b/>
+          <w:bCs/>
+        </w:rPr>
+        <w:t xml:space="preserve">JWT Access Token Authentication </w:t>
+      </w:r>
+    </w:p>
+    <w:p>
+      <w:pPr>
+        <w:numPr>
+          <w:ilvl w:val="0"/>
+          <w:numId w:val="6"/>
+        </w:numPr>
+        <w:rPr>
+          <w:b/>
+          <w:bCs/>
+        </w:rPr>
+      </w:pPr>
+      <w:r>
+        <w:rPr>
+          <w:b/>
+          <w:bCs/>
+        </w:rPr>
+        <w:t xml:space="preserve">Refresh Token Rotation </w:t>
+      </w:r>
+    </w:p>
+    <w:p>
+      <w:pPr>
+        <w:numPr>
+          <w:ilvl w:val="0"/>
+          <w:numId w:val="6"/>
+        </w:numPr>
+        <w:rPr>
+          <w:b/>
+          <w:bCs/>
+        </w:rPr>
+      </w:pPr>
+      <w:r>
+        <w:rPr>
+          <w:b/>
+          <w:bCs/>
+        </w:rPr>
+        <w:t xml:space="preserve">HTTP-only Cookies </w:t>
+      </w:r>
+    </w:p>
+    <w:p>
+      <w:pPr>
+        <w:numPr>
+          <w:ilvl w:val="0"/>
+          <w:numId w:val="6"/>
+        </w:numPr>
+        <w:rPr>
+          <w:b/>
+          <w:bCs/>
+        </w:rPr>
+      </w:pPr>
+      <w:r>
+        <w:rPr>
+          <w:b/>
+          <w:bCs/>
+        </w:rPr>
+        <w:t xml:space="preserve">Protected API Endpoints </w:t>
+      </w:r>
+    </w:p>
+    <w:p>
+      <w:pPr>
+        <w:numPr>
+          <w:ilvl w:val="0"/>
+          <w:numId w:val="6"/>
+        </w:numPr>
+        <w:rPr>
+          <w:b/>
+          <w:bCs/>
+        </w:rPr>
+      </w:pPr>
+      <w:r>
+        <w:rPr>
+          <w:b/>
+          <w:bCs/>
+        </w:rPr>
+        <w:t xml:space="preserve">Role-Based Authorization </w:t>
+      </w:r>
+    </w:p>
+    <w:p>
+      <w:pPr>
+        <w:numPr>
+          <w:ilvl w:val="0"/>
+          <w:numId w:val="6"/>
+        </w:numPr>
+        <w:rPr>
+          <w:b/>
+          <w:bCs/>
+        </w:rPr>
+      </w:pPr>
+      <w:r>
+        <w:rPr>
+          <w:b/>
+          <w:bCs/>
+        </w:rPr>
+        <w:t xml:space="preserve">Secure Password Storage </w:t>
+      </w:r>
+    </w:p>
+    <w:p>
+      <w:pPr>
+        <w:numPr>
+          <w:ilvl w:val="0"/>
+          <w:numId w:val="6"/>
+        </w:numPr>
+        <w:rPr>
+          <w:b/>
+          <w:bCs/>
+        </w:rPr>
+      </w:pPr>
+      <w:r>
+        <w:rPr>
+          <w:b/>
+          <w:bCs/>
+        </w:rPr>
+        <w:t>Session Revocation using Refresh Token</w:t>
+      </w:r>
+    </w:p>
+    <w:p>
+      <w:pPr>
+        <w:rPr>
+          <w:b/>
+          <w:bCs/>
+        </w:rPr>
+      </w:pPr>
+    </w:p>
     <w:sectPr>
       <w:pgSz w:w="11906" w:h="16838"/>
       <w:pgMar w:top="1440" w:right="1440" w:bottom="1440" w:left="1440" w:header="708" w:footer="708" w:gutter="0"/>
@@ -2639,9 +5777,9 @@
     </w:lvl>
   </w:abstractNum>
   <w:abstractNum w:abstractNumId="1" w15:restartNumberingAfterBreak="0">
-    <w:nsid w:val="794939C8"/>
+    <w:nsid w:val="28876E16"/>
     <w:multiLevelType w:val="multilevel"/>
-    <w:tmpl w:val="E9F4BDB8"/>
+    <w:tmpl w:val="0AE0B204"/>
     <w:lvl w:ilvl="0">
       <w:start w:val="1"/>
       <w:numFmt w:val="bullet"/>
@@ -2787,11 +5925,619 @@
       </w:rPr>
     </w:lvl>
   </w:abstractNum>
+  <w:abstractNum w:abstractNumId="2" w15:restartNumberingAfterBreak="0">
+    <w:nsid w:val="4EF00959"/>
+    <w:multiLevelType w:val="multilevel"/>
+    <w:tmpl w:val="B2260630"/>
+    <w:lvl w:ilvl="0">
+      <w:start w:val="1"/>
+      <w:numFmt w:val="bullet"/>
+      <w:lvlText w:val=""/>
+      <w:lvlJc w:val="left"/>
+      <w:pPr>
+        <w:tabs>
+          <w:tab w:val="num" w:pos="720"/>
+        </w:tabs>
+        <w:ind w:left="720" w:hanging="360"/>
+      </w:pPr>
+      <w:rPr>
+        <w:rFonts w:ascii="Symbol" w:hAnsi="Symbol" w:hint="default"/>
+        <w:sz w:val="20"/>
+      </w:rPr>
+    </w:lvl>
+    <w:lvl w:ilvl="1" w:tentative="1">
+      <w:start w:val="1"/>
+      <w:numFmt w:val="bullet"/>
+      <w:lvlText w:val="o"/>
+      <w:lvlJc w:val="left"/>
+      <w:pPr>
+        <w:tabs>
+          <w:tab w:val="num" w:pos="1440"/>
+        </w:tabs>
+        <w:ind w:left="1440" w:hanging="360"/>
+      </w:pPr>
+      <w:rPr>
+        <w:rFonts w:ascii="Courier New" w:hAnsi="Courier New" w:hint="default"/>
+        <w:sz w:val="20"/>
+      </w:rPr>
+    </w:lvl>
+    <w:lvl w:ilvl="2" w:tentative="1">
+      <w:start w:val="1"/>
+      <w:numFmt w:val="bullet"/>
+      <w:lvlText w:val=""/>
+      <w:lvlJc w:val="left"/>
+      <w:pPr>
+        <w:tabs>
+          <w:tab w:val="num" w:pos="2160"/>
+        </w:tabs>
+        <w:ind w:left="2160" w:hanging="360"/>
+      </w:pPr>
+      <w:rPr>
+        <w:rFonts w:ascii="Wingdings" w:hAnsi="Wingdings" w:hint="default"/>
+        <w:sz w:val="20"/>
+      </w:rPr>
+    </w:lvl>
+    <w:lvl w:ilvl="3" w:tentative="1">
+      <w:start w:val="1"/>
+      <w:numFmt w:val="bullet"/>
+      <w:lvlText w:val=""/>
+      <w:lvlJc w:val="left"/>
+      <w:pPr>
+        <w:tabs>
+          <w:tab w:val="num" w:pos="2880"/>
+        </w:tabs>
+        <w:ind w:left="2880" w:hanging="360"/>
+      </w:pPr>
+      <w:rPr>
+        <w:rFonts w:ascii="Wingdings" w:hAnsi="Wingdings" w:hint="default"/>
+        <w:sz w:val="20"/>
+      </w:rPr>
+    </w:lvl>
+    <w:lvl w:ilvl="4" w:tentative="1">
+      <w:start w:val="1"/>
+      <w:numFmt w:val="bullet"/>
+      <w:lvlText w:val=""/>
+      <w:lvlJc w:val="left"/>
+      <w:pPr>
+        <w:tabs>
+          <w:tab w:val="num" w:pos="3600"/>
+        </w:tabs>
+        <w:ind w:left="3600" w:hanging="360"/>
+      </w:pPr>
+      <w:rPr>
+        <w:rFonts w:ascii="Wingdings" w:hAnsi="Wingdings" w:hint="default"/>
+        <w:sz w:val="20"/>
+      </w:rPr>
+    </w:lvl>
+    <w:lvl w:ilvl="5" w:tentative="1">
+      <w:start w:val="1"/>
+      <w:numFmt w:val="bullet"/>
+      <w:lvlText w:val=""/>
+      <w:lvlJc w:val="left"/>
+      <w:pPr>
+        <w:tabs>
+          <w:tab w:val="num" w:pos="4320"/>
+        </w:tabs>
+        <w:ind w:left="4320" w:hanging="360"/>
+      </w:pPr>
+      <w:rPr>
+        <w:rFonts w:ascii="Wingdings" w:hAnsi="Wingdings" w:hint="default"/>
+        <w:sz w:val="20"/>
+      </w:rPr>
+    </w:lvl>
+    <w:lvl w:ilvl="6" w:tentative="1">
+      <w:start w:val="1"/>
+      <w:numFmt w:val="bullet"/>
+      <w:lvlText w:val=""/>
+      <w:lvlJc w:val="left"/>
+      <w:pPr>
+        <w:tabs>
+          <w:tab w:val="num" w:pos="5040"/>
+        </w:tabs>
+        <w:ind w:left="5040" w:hanging="360"/>
+      </w:pPr>
+      <w:rPr>
+        <w:rFonts w:ascii="Wingdings" w:hAnsi="Wingdings" w:hint="default"/>
+        <w:sz w:val="20"/>
+      </w:rPr>
+    </w:lvl>
+    <w:lvl w:ilvl="7" w:tentative="1">
+      <w:start w:val="1"/>
+      <w:numFmt w:val="bullet"/>
+      <w:lvlText w:val=""/>
+      <w:lvlJc w:val="left"/>
+      <w:pPr>
+        <w:tabs>
+          <w:tab w:val="num" w:pos="5760"/>
+        </w:tabs>
+        <w:ind w:left="5760" w:hanging="360"/>
+      </w:pPr>
+      <w:rPr>
+        <w:rFonts w:ascii="Wingdings" w:hAnsi="Wingdings" w:hint="default"/>
+        <w:sz w:val="20"/>
+      </w:rPr>
+    </w:lvl>
+    <w:lvl w:ilvl="8" w:tentative="1">
+      <w:start w:val="1"/>
+      <w:numFmt w:val="bullet"/>
+      <w:lvlText w:val=""/>
+      <w:lvlJc w:val="left"/>
+      <w:pPr>
+        <w:tabs>
+          <w:tab w:val="num" w:pos="6480"/>
+        </w:tabs>
+        <w:ind w:left="6480" w:hanging="360"/>
+      </w:pPr>
+      <w:rPr>
+        <w:rFonts w:ascii="Wingdings" w:hAnsi="Wingdings" w:hint="default"/>
+        <w:sz w:val="20"/>
+      </w:rPr>
+    </w:lvl>
+  </w:abstractNum>
+  <w:abstractNum w:abstractNumId="3" w15:restartNumberingAfterBreak="0">
+    <w:nsid w:val="71B626CF"/>
+    <w:multiLevelType w:val="multilevel"/>
+    <w:tmpl w:val="FD7E6F40"/>
+    <w:lvl w:ilvl="0">
+      <w:start w:val="1"/>
+      <w:numFmt w:val="bullet"/>
+      <w:lvlText w:val=""/>
+      <w:lvlJc w:val="left"/>
+      <w:pPr>
+        <w:tabs>
+          <w:tab w:val="num" w:pos="720"/>
+        </w:tabs>
+        <w:ind w:left="720" w:hanging="360"/>
+      </w:pPr>
+      <w:rPr>
+        <w:rFonts w:ascii="Symbol" w:hAnsi="Symbol" w:hint="default"/>
+        <w:sz w:val="20"/>
+      </w:rPr>
+    </w:lvl>
+    <w:lvl w:ilvl="1" w:tentative="1">
+      <w:start w:val="1"/>
+      <w:numFmt w:val="bullet"/>
+      <w:lvlText w:val="o"/>
+      <w:lvlJc w:val="left"/>
+      <w:pPr>
+        <w:tabs>
+          <w:tab w:val="num" w:pos="1440"/>
+        </w:tabs>
+        <w:ind w:left="1440" w:hanging="360"/>
+      </w:pPr>
+      <w:rPr>
+        <w:rFonts w:ascii="Courier New" w:hAnsi="Courier New" w:hint="default"/>
+        <w:sz w:val="20"/>
+      </w:rPr>
+    </w:lvl>
+    <w:lvl w:ilvl="2" w:tentative="1">
+      <w:start w:val="1"/>
+      <w:numFmt w:val="bullet"/>
+      <w:lvlText w:val=""/>
+      <w:lvlJc w:val="left"/>
+      <w:pPr>
+        <w:tabs>
+          <w:tab w:val="num" w:pos="2160"/>
+        </w:tabs>
+        <w:ind w:left="2160" w:hanging="360"/>
+      </w:pPr>
+      <w:rPr>
+        <w:rFonts w:ascii="Wingdings" w:hAnsi="Wingdings" w:hint="default"/>
+        <w:sz w:val="20"/>
+      </w:rPr>
+    </w:lvl>
+    <w:lvl w:ilvl="3" w:tentative="1">
+      <w:start w:val="1"/>
+      <w:numFmt w:val="bullet"/>
+      <w:lvlText w:val=""/>
+      <w:lvlJc w:val="left"/>
+      <w:pPr>
+        <w:tabs>
+          <w:tab w:val="num" w:pos="2880"/>
+        </w:tabs>
+        <w:ind w:left="2880" w:hanging="360"/>
+      </w:pPr>
+      <w:rPr>
+        <w:rFonts w:ascii="Wingdings" w:hAnsi="Wingdings" w:hint="default"/>
+        <w:sz w:val="20"/>
+      </w:rPr>
+    </w:lvl>
+    <w:lvl w:ilvl="4" w:tentative="1">
+      <w:start w:val="1"/>
+      <w:numFmt w:val="bullet"/>
+      <w:lvlText w:val=""/>
+      <w:lvlJc w:val="left"/>
+      <w:pPr>
+        <w:tabs>
+          <w:tab w:val="num" w:pos="3600"/>
+        </w:tabs>
+        <w:ind w:left="3600" w:hanging="360"/>
+      </w:pPr>
+      <w:rPr>
+        <w:rFonts w:ascii="Wingdings" w:hAnsi="Wingdings" w:hint="default"/>
+        <w:sz w:val="20"/>
+      </w:rPr>
+    </w:lvl>
+    <w:lvl w:ilvl="5" w:tentative="1">
+      <w:start w:val="1"/>
+      <w:numFmt w:val="bullet"/>
+      <w:lvlText w:val=""/>
+      <w:lvlJc w:val="left"/>
+      <w:pPr>
+        <w:tabs>
+          <w:tab w:val="num" w:pos="4320"/>
+        </w:tabs>
+        <w:ind w:left="4320" w:hanging="360"/>
+      </w:pPr>
+      <w:rPr>
+        <w:rFonts w:ascii="Wingdings" w:hAnsi="Wingdings" w:hint="default"/>
+        <w:sz w:val="20"/>
+      </w:rPr>
+    </w:lvl>
+    <w:lvl w:ilvl="6" w:tentative="1">
+      <w:start w:val="1"/>
+      <w:numFmt w:val="bullet"/>
+      <w:lvlText w:val=""/>
+      <w:lvlJc w:val="left"/>
+      <w:pPr>
+        <w:tabs>
+          <w:tab w:val="num" w:pos="5040"/>
+        </w:tabs>
+        <w:ind w:left="5040" w:hanging="360"/>
+      </w:pPr>
+      <w:rPr>
+        <w:rFonts w:ascii="Wingdings" w:hAnsi="Wingdings" w:hint="default"/>
+        <w:sz w:val="20"/>
+      </w:rPr>
+    </w:lvl>
+    <w:lvl w:ilvl="7" w:tentative="1">
+      <w:start w:val="1"/>
+      <w:numFmt w:val="bullet"/>
+      <w:lvlText w:val=""/>
+      <w:lvlJc w:val="left"/>
+      <w:pPr>
+        <w:tabs>
+          <w:tab w:val="num" w:pos="5760"/>
+        </w:tabs>
+        <w:ind w:left="5760" w:hanging="360"/>
+      </w:pPr>
+      <w:rPr>
+        <w:rFonts w:ascii="Wingdings" w:hAnsi="Wingdings" w:hint="default"/>
+        <w:sz w:val="20"/>
+      </w:rPr>
+    </w:lvl>
+    <w:lvl w:ilvl="8" w:tentative="1">
+      <w:start w:val="1"/>
+      <w:numFmt w:val="bullet"/>
+      <w:lvlText w:val=""/>
+      <w:lvlJc w:val="left"/>
+      <w:pPr>
+        <w:tabs>
+          <w:tab w:val="num" w:pos="6480"/>
+        </w:tabs>
+        <w:ind w:left="6480" w:hanging="360"/>
+      </w:pPr>
+      <w:rPr>
+        <w:rFonts w:ascii="Wingdings" w:hAnsi="Wingdings" w:hint="default"/>
+        <w:sz w:val="20"/>
+      </w:rPr>
+    </w:lvl>
+  </w:abstractNum>
+  <w:abstractNum w:abstractNumId="4" w15:restartNumberingAfterBreak="0">
+    <w:nsid w:val="76D17955"/>
+    <w:multiLevelType w:val="multilevel"/>
+    <w:tmpl w:val="EB5A864E"/>
+    <w:lvl w:ilvl="0">
+      <w:start w:val="1"/>
+      <w:numFmt w:val="bullet"/>
+      <w:lvlText w:val=""/>
+      <w:lvlJc w:val="left"/>
+      <w:pPr>
+        <w:tabs>
+          <w:tab w:val="num" w:pos="720"/>
+        </w:tabs>
+        <w:ind w:left="720" w:hanging="360"/>
+      </w:pPr>
+      <w:rPr>
+        <w:rFonts w:ascii="Symbol" w:hAnsi="Symbol" w:hint="default"/>
+        <w:sz w:val="20"/>
+      </w:rPr>
+    </w:lvl>
+    <w:lvl w:ilvl="1" w:tentative="1">
+      <w:start w:val="1"/>
+      <w:numFmt w:val="bullet"/>
+      <w:lvlText w:val="o"/>
+      <w:lvlJc w:val="left"/>
+      <w:pPr>
+        <w:tabs>
+          <w:tab w:val="num" w:pos="1440"/>
+        </w:tabs>
+        <w:ind w:left="1440" w:hanging="360"/>
+      </w:pPr>
+      <w:rPr>
+        <w:rFonts w:ascii="Courier New" w:hAnsi="Courier New" w:hint="default"/>
+        <w:sz w:val="20"/>
+      </w:rPr>
+    </w:lvl>
+    <w:lvl w:ilvl="2" w:tentative="1">
+      <w:start w:val="1"/>
+      <w:numFmt w:val="bullet"/>
+      <w:lvlText w:val=""/>
+      <w:lvlJc w:val="left"/>
+      <w:pPr>
+        <w:tabs>
+          <w:tab w:val="num" w:pos="2160"/>
+        </w:tabs>
+        <w:ind w:left="2160" w:hanging="360"/>
+      </w:pPr>
+      <w:rPr>
+        <w:rFonts w:ascii="Wingdings" w:hAnsi="Wingdings" w:hint="default"/>
+        <w:sz w:val="20"/>
+      </w:rPr>
+    </w:lvl>
+    <w:lvl w:ilvl="3" w:tentative="1">
+      <w:start w:val="1"/>
+      <w:numFmt w:val="bullet"/>
+      <w:lvlText w:val=""/>
+      <w:lvlJc w:val="left"/>
+      <w:pPr>
+        <w:tabs>
+          <w:tab w:val="num" w:pos="2880"/>
+        </w:tabs>
+        <w:ind w:left="2880" w:hanging="360"/>
+      </w:pPr>
+      <w:rPr>
+        <w:rFonts w:ascii="Wingdings" w:hAnsi="Wingdings" w:hint="default"/>
+        <w:sz w:val="20"/>
+      </w:rPr>
+    </w:lvl>
+    <w:lvl w:ilvl="4" w:tentative="1">
+      <w:start w:val="1"/>
+      <w:numFmt w:val="bullet"/>
+      <w:lvlText w:val=""/>
+      <w:lvlJc w:val="left"/>
+      <w:pPr>
+        <w:tabs>
+          <w:tab w:val="num" w:pos="3600"/>
+        </w:tabs>
+        <w:ind w:left="3600" w:hanging="360"/>
+      </w:pPr>
+      <w:rPr>
+        <w:rFonts w:ascii="Wingdings" w:hAnsi="Wingdings" w:hint="default"/>
+        <w:sz w:val="20"/>
+      </w:rPr>
+    </w:lvl>
+    <w:lvl w:ilvl="5" w:tentative="1">
+      <w:start w:val="1"/>
+      <w:numFmt w:val="bullet"/>
+      <w:lvlText w:val=""/>
+      <w:lvlJc w:val="left"/>
+      <w:pPr>
+        <w:tabs>
+          <w:tab w:val="num" w:pos="4320"/>
+        </w:tabs>
+        <w:ind w:left="4320" w:hanging="360"/>
+      </w:pPr>
+      <w:rPr>
+        <w:rFonts w:ascii="Wingdings" w:hAnsi="Wingdings" w:hint="default"/>
+        <w:sz w:val="20"/>
+      </w:rPr>
+    </w:lvl>
+    <w:lvl w:ilvl="6" w:tentative="1">
+      <w:start w:val="1"/>
+      <w:numFmt w:val="bullet"/>
+      <w:lvlText w:val=""/>
+      <w:lvlJc w:val="left"/>
+      <w:pPr>
+        <w:tabs>
+          <w:tab w:val="num" w:pos="5040"/>
+        </w:tabs>
+        <w:ind w:left="5040" w:hanging="360"/>
+      </w:pPr>
+      <w:rPr>
+        <w:rFonts w:ascii="Wingdings" w:hAnsi="Wingdings" w:hint="default"/>
+        <w:sz w:val="20"/>
+      </w:rPr>
+    </w:lvl>
+    <w:lvl w:ilvl="7" w:tentative="1">
+      <w:start w:val="1"/>
+      <w:numFmt w:val="bullet"/>
+      <w:lvlText w:val=""/>
+      <w:lvlJc w:val="left"/>
+      <w:pPr>
+        <w:tabs>
+          <w:tab w:val="num" w:pos="5760"/>
+        </w:tabs>
+        <w:ind w:left="5760" w:hanging="360"/>
+      </w:pPr>
+      <w:rPr>
+        <w:rFonts w:ascii="Wingdings" w:hAnsi="Wingdings" w:hint="default"/>
+        <w:sz w:val="20"/>
+      </w:rPr>
+    </w:lvl>
+    <w:lvl w:ilvl="8" w:tentative="1">
+      <w:start w:val="1"/>
+      <w:numFmt w:val="bullet"/>
+      <w:lvlText w:val=""/>
+      <w:lvlJc w:val="left"/>
+      <w:pPr>
+        <w:tabs>
+          <w:tab w:val="num" w:pos="6480"/>
+        </w:tabs>
+        <w:ind w:left="6480" w:hanging="360"/>
+      </w:pPr>
+      <w:rPr>
+        <w:rFonts w:ascii="Wingdings" w:hAnsi="Wingdings" w:hint="default"/>
+        <w:sz w:val="20"/>
+      </w:rPr>
+    </w:lvl>
+  </w:abstractNum>
+  <w:abstractNum w:abstractNumId="5" w15:restartNumberingAfterBreak="0">
+    <w:nsid w:val="794939C8"/>
+    <w:multiLevelType w:val="multilevel"/>
+    <w:tmpl w:val="E9F4BDB8"/>
+    <w:lvl w:ilvl="0">
+      <w:start w:val="1"/>
+      <w:numFmt w:val="bullet"/>
+      <w:lvlText w:val=""/>
+      <w:lvlJc w:val="left"/>
+      <w:pPr>
+        <w:tabs>
+          <w:tab w:val="num" w:pos="720"/>
+        </w:tabs>
+        <w:ind w:left="720" w:hanging="360"/>
+      </w:pPr>
+      <w:rPr>
+        <w:rFonts w:ascii="Symbol" w:hAnsi="Symbol" w:hint="default"/>
+        <w:sz w:val="20"/>
+      </w:rPr>
+    </w:lvl>
+    <w:lvl w:ilvl="1" w:tentative="1">
+      <w:start w:val="1"/>
+      <w:numFmt w:val="bullet"/>
+      <w:lvlText w:val="o"/>
+      <w:lvlJc w:val="left"/>
+      <w:pPr>
+        <w:tabs>
+          <w:tab w:val="num" w:pos="1440"/>
+        </w:tabs>
+        <w:ind w:left="1440" w:hanging="360"/>
+      </w:pPr>
+      <w:rPr>
+        <w:rFonts w:ascii="Courier New" w:hAnsi="Courier New" w:hint="default"/>
+        <w:sz w:val="20"/>
+      </w:rPr>
+    </w:lvl>
+    <w:lvl w:ilvl="2" w:tentative="1">
+      <w:start w:val="1"/>
+      <w:numFmt w:val="bullet"/>
+      <w:lvlText w:val=""/>
+      <w:lvlJc w:val="left"/>
+      <w:pPr>
+        <w:tabs>
+          <w:tab w:val="num" w:pos="2160"/>
+        </w:tabs>
+        <w:ind w:left="2160" w:hanging="360"/>
+      </w:pPr>
+      <w:rPr>
+        <w:rFonts w:ascii="Wingdings" w:hAnsi="Wingdings" w:hint="default"/>
+        <w:sz w:val="20"/>
+      </w:rPr>
+    </w:lvl>
+    <w:lvl w:ilvl="3" w:tentative="1">
+      <w:start w:val="1"/>
+      <w:numFmt w:val="bullet"/>
+      <w:lvlText w:val=""/>
+      <w:lvlJc w:val="left"/>
+      <w:pPr>
+        <w:tabs>
+          <w:tab w:val="num" w:pos="2880"/>
+        </w:tabs>
+        <w:ind w:left="2880" w:hanging="360"/>
+      </w:pPr>
+      <w:rPr>
+        <w:rFonts w:ascii="Wingdings" w:hAnsi="Wingdings" w:hint="default"/>
+        <w:sz w:val="20"/>
+      </w:rPr>
+    </w:lvl>
+    <w:lvl w:ilvl="4" w:tentative="1">
+      <w:start w:val="1"/>
+      <w:numFmt w:val="bullet"/>
+      <w:lvlText w:val=""/>
+      <w:lvlJc w:val="left"/>
+      <w:pPr>
+        <w:tabs>
+          <w:tab w:val="num" w:pos="3600"/>
+        </w:tabs>
+        <w:ind w:left="3600" w:hanging="360"/>
+      </w:pPr>
+      <w:rPr>
+        <w:rFonts w:ascii="Wingdings" w:hAnsi="Wingdings" w:hint="default"/>
+        <w:sz w:val="20"/>
+      </w:rPr>
+    </w:lvl>
+    <w:lvl w:ilvl="5" w:tentative="1">
+      <w:start w:val="1"/>
+      <w:numFmt w:val="bullet"/>
+      <w:lvlText w:val=""/>
+      <w:lvlJc w:val="left"/>
+      <w:pPr>
+        <w:tabs>
+          <w:tab w:val="num" w:pos="4320"/>
+        </w:tabs>
+        <w:ind w:left="4320" w:hanging="360"/>
+      </w:pPr>
+      <w:rPr>
+        <w:rFonts w:ascii="Wingdings" w:hAnsi="Wingdings" w:hint="default"/>
+        <w:sz w:val="20"/>
+      </w:rPr>
+    </w:lvl>
+    <w:lvl w:ilvl="6" w:tentative="1">
+      <w:start w:val="1"/>
+      <w:numFmt w:val="bullet"/>
+      <w:lvlText w:val=""/>
+      <w:lvlJc w:val="left"/>
+      <w:pPr>
+        <w:tabs>
+          <w:tab w:val="num" w:pos="5040"/>
+        </w:tabs>
+        <w:ind w:left="5040" w:hanging="360"/>
+      </w:pPr>
+      <w:rPr>
+        <w:rFonts w:ascii="Wingdings" w:hAnsi="Wingdings" w:hint="default"/>
+        <w:sz w:val="20"/>
+      </w:rPr>
+    </w:lvl>
+    <w:lvl w:ilvl="7" w:tentative="1">
+      <w:start w:val="1"/>
+      <w:numFmt w:val="bullet"/>
+      <w:lvlText w:val=""/>
+      <w:lvlJc w:val="left"/>
+      <w:pPr>
+        <w:tabs>
+          <w:tab w:val="num" w:pos="5760"/>
+        </w:tabs>
+        <w:ind w:left="5760" w:hanging="360"/>
+      </w:pPr>
+      <w:rPr>
+        <w:rFonts w:ascii="Wingdings" w:hAnsi="Wingdings" w:hint="default"/>
+        <w:sz w:val="20"/>
+      </w:rPr>
+    </w:lvl>
+    <w:lvl w:ilvl="8" w:tentative="1">
+      <w:start w:val="1"/>
+      <w:numFmt w:val="bullet"/>
+      <w:lvlText w:val=""/>
+      <w:lvlJc w:val="left"/>
+      <w:pPr>
+        <w:tabs>
+          <w:tab w:val="num" w:pos="6480"/>
+        </w:tabs>
+        <w:ind w:left="6480" w:hanging="360"/>
+      </w:pPr>
+      <w:rPr>
+        <w:rFonts w:ascii="Wingdings" w:hAnsi="Wingdings" w:hint="default"/>
+        <w:sz w:val="20"/>
+      </w:rPr>
+    </w:lvl>
+  </w:abstractNum>
   <w:num w:numId="1" w16cid:durableId="1962179738">
-    <w:abstractNumId w:val="1"/>
+    <w:abstractNumId w:val="5"/>
   </w:num>
   <w:num w:numId="2" w16cid:durableId="1515461839">
     <w:abstractNumId w:val="0"/>
+  </w:num>
+  <w:num w:numId="3" w16cid:durableId="1291479371">
+    <w:abstractNumId w:val="2"/>
+  </w:num>
+  <w:num w:numId="4" w16cid:durableId="1639873183">
+    <w:abstractNumId w:val="1"/>
+  </w:num>
+  <w:num w:numId="5" w16cid:durableId="1076827339">
+    <w:abstractNumId w:val="3"/>
+  </w:num>
+  <w:num w:numId="6" w16cid:durableId="1975598422">
+    <w:abstractNumId w:val="4"/>
   </w:num>
 </w:numbering>
 </file>

</xml_diff>